<commit_message>
docs(report): add AME1 time-series figure to the GNSS section
Co-Authored-By: Claude Opus 5.5 <noreply@anthropic.com>
Claude-Session: https://claude.ai/code/session_01PT88ya4kvSxXN1gjfrDKxd
</commit_message>
<xml_diff>
--- a/docs/raport/EGMS_raport_spotkanie_2026-10-16.docx
+++ b/docs/raport/EGMS_raport_spotkanie_2026-10-16.docx
@@ -713,7 +713,7 @@
       </w:r>
     </w:p>
     <w:bookmarkEnd w:id="22"/>
-    <w:bookmarkStart w:id="26" w:name="Xb3db16b1eba88ebb1942668ccdf71336c184e41"/>
+    <w:bookmarkStart w:id="29" w:name="Xb3db16b1eba88ebb1942668ccdf71336c184e41"/>
     <w:p>
       <w:pPr>
         <w:pStyle w:val="Heading1"/>
@@ -1039,31 +1039,13 @@
           <w:bCs/>
           <w:b/>
         </w:rPr>
-        <w:t xml:space="preserve">Ograniczenie:</w:t>
-      </w:r>
-      <w:r>
-        <w:t xml:space="preserve"> </w:t>
-      </w:r>
-      <w:r>
-        <w:t xml:space="preserve">EGMS jest kalibrowany modelem GNSS, więc to porównanie nie jest w pełni niezależne.</w:t>
-      </w:r>
-    </w:p>
-    <w:bookmarkEnd w:id="26"/>
-    <w:bookmarkStart w:id="39" w:name="Xcf1241a5b0d5b5b7ff5886d23cd7ddc69895afe"/>
-    <w:p>
-      <w:pPr>
-        <w:pStyle w:val="Heading1"/>
-      </w:pPr>
-      <w:r>
-        <w:t xml:space="preserve">Wynik 2: niwelacja w NRW — niecki się zgadzają, poziom jest przesunięty</w:t>
-      </w:r>
-    </w:p>
-    <w:p>
-      <w:pPr>
-        <w:pStyle w:val="FirstParagraph"/>
-      </w:pPr>
-      <w:r>
-        <w:t xml:space="preserve">Zmiana wysokości z EGMS idzie prawie 1:1 ze zmianą z niwelacji (nachylenie 0,96), od 0 do −140 mm w 3 lata. Cała chmura punktów jest jednak lekko przesunięta w dół: EGMS pokazuje wszędzie trochę więcej osiadania.</w:t>
+        <w:t xml:space="preserve">Przykładowa stacja w czasie: AME1.</w:t>
+      </w:r>
+      <w:r>
+        <w:t xml:space="preserve"> </w:t>
+      </w:r>
+      <w:r>
+        <w:t xml:space="preserve">Każdy panel to jedna ścieżka satelity (ruch w kierunku satelity, LOS) albo ruch pionowy (U). Niebieska linia to EGMS, pomarańczowe kropki to dobowe pozycje GNSS przeliczone na ten sam kierunek.</w:t>
       </w:r>
     </w:p>
     <w:p>
@@ -1073,20 +1055,119 @@
       <w:r>
         <w:drawing>
           <wp:inline>
-            <wp:extent cx="5334000" cy="4178926"/>
+            <wp:extent cx="5334000" cy="8919732"/>
             <wp:effectExtent b="0" l="0" r="0" t="0"/>
-            <wp:docPr descr="Mapa tempa ruchu pionowego EGMS 2019–2023: czerwone plamy to niecki osiadania, trójkąty to stacje GNSS, kółka to repery pokazane niżej" title="" id="28" name="Picture"/>
+            <wp:docPr descr="Stacja AME1, Groningen 2020–2024: EGMS (niebieska linia) i dobowe GNSS (pomarańczowe kropki) na czterech ścieżkach satelity i w pionie" title="" id="27" name="Picture"/>
             <a:graphic>
               <a:graphicData uri="http://schemas.openxmlformats.org/drawingml/2006/picture">
                 <pic:pic>
                   <pic:nvPicPr>
-                    <pic:cNvPr descr="/tmp/claude-0/-home-user-2-geoworldlook-egmscheck/adccf45a-26f6-515f-aa00-03d5d0c40b81/scratchpad/docimg2/nrw_mapa_2019_2023.png" id="29" name="Picture"/>
+                    <pic:cNvPr descr="/tmp/claude-0/-home-user-2-geoworldlook-egmscheck/adccf45a-26f6-515f-aa00-03d5d0c40b81/scratchpad/docimg2/groningen_AME1_szeregi.png" id="28" name="Picture"/>
                     <pic:cNvPicPr>
                       <a:picLocks noChangeArrowheads="1" noChangeAspect="1"/>
                     </pic:cNvPicPr>
                   </pic:nvPicPr>
                   <pic:blipFill>
-                    <a:blip r:embed="rId27"/>
+                    <a:blip r:embed="rId26"/>
+                    <a:stretch>
+                      <a:fillRect/>
+                    </a:stretch>
+                  </pic:blipFill>
+                  <pic:spPr bwMode="auto">
+                    <a:xfrm>
+                      <a:off x="0" y="0"/>
+                      <a:ext cx="5334000" cy="8919732"/>
+                    </a:xfrm>
+                    <a:prstGeom prst="rect">
+                      <a:avLst/>
+                    </a:prstGeom>
+                    <a:noFill/>
+                    <a:ln w="9525">
+                      <a:noFill/>
+                      <a:headEnd/>
+                      <a:tailEnd/>
+                    </a:ln>
+                  </pic:spPr>
+                </pic:pic>
+              </a:graphicData>
+            </a:graphic>
+          </wp:inline>
+        </w:drawing>
+      </w:r>
+    </w:p>
+    <w:p>
+      <w:pPr>
+        <w:pStyle w:val="ImageCaption"/>
+      </w:pPr>
+      <w:r>
+        <w:t xml:space="preserve">Stacja AME1, Groningen 2020–2024: EGMS (niebieska linia) i dobowe GNSS (pomarańczowe kropki) na czterech ścieżkach satelity i w pionie</w:t>
+      </w:r>
+    </w:p>
+    <w:p>
+      <w:pPr>
+        <w:pStyle w:val="BodyText"/>
+      </w:pPr>
+      <w:r>
+        <w:t xml:space="preserve">Na wszystkich ścieżkach trend jest ten sam: ok. −20 do −30 mm w 5 lat. GNSS ma jednak duży ruch sezonowy (ok. ±10 mm w ciągu roku), którego EGMS prawie nie pokazuje. Dlatego tempo osiadania (K1) się zgadza, a rozrzut różnicy szeregów (K2, 4,7 mm) jest blisko progu. Przyczyny tej różnicy sezonowej nie badaliśmy. Pojedyncze skoki EGMS (np. ścieżka 15) to pojedyncze daty z odstającą wartością EGMS; nie zmieniają trendu.</w:t>
+      </w:r>
+    </w:p>
+    <w:p>
+      <w:pPr>
+        <w:pStyle w:val="BodyText"/>
+      </w:pPr>
+      <w:r>
+        <w:rPr>
+          <w:bCs/>
+          <w:b/>
+        </w:rPr>
+        <w:t xml:space="preserve">Ograniczenie:</w:t>
+      </w:r>
+      <w:r>
+        <w:t xml:space="preserve"> </w:t>
+      </w:r>
+      <w:r>
+        <w:t xml:space="preserve">EGMS jest kalibrowany modelem GNSS, więc to porównanie nie jest w pełni niezależne.</w:t>
+      </w:r>
+    </w:p>
+    <w:bookmarkEnd w:id="29"/>
+    <w:bookmarkStart w:id="42" w:name="Xcf1241a5b0d5b5b7ff5886d23cd7ddc69895afe"/>
+    <w:p>
+      <w:pPr>
+        <w:pStyle w:val="Heading1"/>
+      </w:pPr>
+      <w:r>
+        <w:t xml:space="preserve">Wynik 2: niwelacja w NRW — niecki się zgadzają, poziom jest przesunięty</w:t>
+      </w:r>
+    </w:p>
+    <w:p>
+      <w:pPr>
+        <w:pStyle w:val="FirstParagraph"/>
+      </w:pPr>
+      <w:r>
+        <w:t xml:space="preserve">Zmiana wysokości z EGMS idzie prawie 1:1 ze zmianą z niwelacji (nachylenie 0,96), od 0 do −140 mm w 3 lata. Cała chmura punktów jest jednak lekko przesunięta w dół: EGMS pokazuje wszędzie trochę więcej osiadania.</w:t>
+      </w:r>
+    </w:p>
+    <w:p>
+      <w:pPr>
+        <w:pStyle w:val="CaptionedFigure"/>
+      </w:pPr>
+      <w:r>
+        <w:drawing>
+          <wp:inline>
+            <wp:extent cx="5334000" cy="4178926"/>
+            <wp:effectExtent b="0" l="0" r="0" t="0"/>
+            <wp:docPr descr="Mapa tempa ruchu pionowego EGMS 2019–2023: czerwone plamy to niecki osiadania, trójkąty to stacje GNSS, kółka to repery pokazane niżej" title="" id="31" name="Picture"/>
+            <a:graphic>
+              <a:graphicData uri="http://schemas.openxmlformats.org/drawingml/2006/picture">
+                <pic:pic>
+                  <pic:nvPicPr>
+                    <pic:cNvPr descr="/tmp/claude-0/-home-user-2-geoworldlook-egmscheck/adccf45a-26f6-515f-aa00-03d5d0c40b81/scratchpad/docimg2/nrw_mapa_2019_2023.png" id="32" name="Picture"/>
+                    <pic:cNvPicPr>
+                      <a:picLocks noChangeArrowheads="1" noChangeAspect="1"/>
+                    </pic:cNvPicPr>
+                  </pic:nvPicPr>
+                  <pic:blipFill>
+                    <a:blip r:embed="rId30"/>
                     <a:stretch>
                       <a:fillRect/>
                     </a:stretch>
@@ -1130,18 +1211,18 @@
           <wp:inline>
             <wp:extent cx="4679999" cy="4930118"/>
             <wp:effectExtent b="0" l="0" r="0" t="0"/>
-            <wp:docPr descr="Zmiana wysokości 2019–2022: niwelacja (oś pozioma) kontra EGMS (oś pionowa), 1216 reperów; pomarańczowe punkty to repery w nieckach" title="" id="31" name="Picture"/>
+            <wp:docPr descr="Zmiana wysokości 2019–2022: niwelacja (oś pozioma) kontra EGMS (oś pionowa), 1216 reperów; pomarańczowe punkty to repery w nieckach" title="" id="34" name="Picture"/>
             <a:graphic>
               <a:graphicData uri="http://schemas.openxmlformats.org/drawingml/2006/picture">
                 <pic:pic>
                   <pic:nvPicPr>
-                    <pic:cNvPr descr="/tmp/claude-0/-home-user-2-geoworldlook-egmscheck/adccf45a-26f6-515f-aa00-03d5d0c40b81/scratchpad/docimg2/nrw_rozrzut_pasy.png" id="32" name="Picture"/>
+                    <pic:cNvPr descr="/tmp/claude-0/-home-user-2-geoworldlook-egmscheck/adccf45a-26f6-515f-aa00-03d5d0c40b81/scratchpad/docimg2/nrw_rozrzut_pasy.png" id="35" name="Picture"/>
                     <pic:cNvPicPr>
                       <a:picLocks noChangeArrowheads="1" noChangeAspect="1"/>
                     </pic:cNvPicPr>
                   </pic:nvPicPr>
                   <pic:blipFill>
-                    <a:blip r:embed="rId30"/>
+                    <a:blip r:embed="rId33"/>
                     <a:stretch>
                       <a:fillRect/>
                     </a:stretch>
@@ -1903,67 +1984,12 @@
           <wp:inline>
             <wp:extent cx="5334000" cy="2096786"/>
             <wp:effectExtent b="0" l="0" r="0" t="0"/>
-            <wp:docPr descr="Reper 5104900560, najszybsze osiadanie: niwelacja −140 mm, EGMS −143 mm" title="" id="34" name="Picture"/>
+            <wp:docPr descr="Reper 5104900560, najszybsze osiadanie: niwelacja −140 mm, EGMS −143 mm" title="" id="37" name="Picture"/>
             <a:graphic>
               <a:graphicData uri="http://schemas.openxmlformats.org/drawingml/2006/picture">
                 <pic:pic>
                   <pic:nvPicPr>
-                    <pic:cNvPr descr="/tmp/claude-0/-home-user-2-geoworldlook-egmscheck/adccf45a-26f6-515f-aa00-03d5d0c40b81/scratchpad/docimg2/nrw_reper_5104900560.png" id="35" name="Picture"/>
-                    <pic:cNvPicPr>
-                      <a:picLocks noChangeArrowheads="1" noChangeAspect="1"/>
-                    </pic:cNvPicPr>
-                  </pic:nvPicPr>
-                  <pic:blipFill>
-                    <a:blip r:embed="rId33"/>
-                    <a:stretch>
-                      <a:fillRect/>
-                    </a:stretch>
-                  </pic:blipFill>
-                  <pic:spPr bwMode="auto">
-                    <a:xfrm>
-                      <a:off x="0" y="0"/>
-                      <a:ext cx="5334000" cy="2096786"/>
-                    </a:xfrm>
-                    <a:prstGeom prst="rect">
-                      <a:avLst/>
-                    </a:prstGeom>
-                    <a:noFill/>
-                    <a:ln w="9525">
-                      <a:noFill/>
-                      <a:headEnd/>
-                      <a:tailEnd/>
-                    </a:ln>
-                  </pic:spPr>
-                </pic:pic>
-              </a:graphicData>
-            </a:graphic>
-          </wp:inline>
-        </w:drawing>
-      </w:r>
-    </w:p>
-    <w:p>
-      <w:pPr>
-        <w:pStyle w:val="ImageCaption"/>
-      </w:pPr>
-      <w:r>
-        <w:t xml:space="preserve">Reper 5104900560, najszybsze osiadanie: niwelacja −140 mm, EGMS −143 mm</w:t>
-      </w:r>
-    </w:p>
-    <w:p>
-      <w:pPr>
-        <w:pStyle w:val="CaptionedFigure"/>
-      </w:pPr>
-      <w:r>
-        <w:drawing>
-          <wp:inline>
-            <wp:extent cx="5334000" cy="2096786"/>
-            <wp:effectExtent b="0" l="0" r="0" t="0"/>
-            <wp:docPr descr="Reper 5104900593, mediana niecek: niwelacja −50 mm, EGMS −52 mm" title="" id="37" name="Picture"/>
-            <a:graphic>
-              <a:graphicData uri="http://schemas.openxmlformats.org/drawingml/2006/picture">
-                <pic:pic>
-                  <pic:nvPicPr>
-                    <pic:cNvPr descr="/tmp/claude-0/-home-user-2-geoworldlook-egmscheck/adccf45a-26f6-515f-aa00-03d5d0c40b81/scratchpad/docimg2/nrw_reper_5104900593.png" id="38" name="Picture"/>
+                    <pic:cNvPr descr="/tmp/claude-0/-home-user-2-geoworldlook-egmscheck/adccf45a-26f6-515f-aa00-03d5d0c40b81/scratchpad/docimg2/nrw_reper_5104900560.png" id="38" name="Picture"/>
                     <pic:cNvPicPr>
                       <a:picLocks noChangeArrowheads="1" noChangeAspect="1"/>
                     </pic:cNvPicPr>
@@ -2001,11 +2027,66 @@
         <w:pStyle w:val="ImageCaption"/>
       </w:pPr>
       <w:r>
+        <w:t xml:space="preserve">Reper 5104900560, najszybsze osiadanie: niwelacja −140 mm, EGMS −143 mm</w:t>
+      </w:r>
+    </w:p>
+    <w:p>
+      <w:pPr>
+        <w:pStyle w:val="CaptionedFigure"/>
+      </w:pPr>
+      <w:r>
+        <w:drawing>
+          <wp:inline>
+            <wp:extent cx="5334000" cy="2096786"/>
+            <wp:effectExtent b="0" l="0" r="0" t="0"/>
+            <wp:docPr descr="Reper 5104900593, mediana niecek: niwelacja −50 mm, EGMS −52 mm" title="" id="40" name="Picture"/>
+            <a:graphic>
+              <a:graphicData uri="http://schemas.openxmlformats.org/drawingml/2006/picture">
+                <pic:pic>
+                  <pic:nvPicPr>
+                    <pic:cNvPr descr="/tmp/claude-0/-home-user-2-geoworldlook-egmscheck/adccf45a-26f6-515f-aa00-03d5d0c40b81/scratchpad/docimg2/nrw_reper_5104900593.png" id="41" name="Picture"/>
+                    <pic:cNvPicPr>
+                      <a:picLocks noChangeArrowheads="1" noChangeAspect="1"/>
+                    </pic:cNvPicPr>
+                  </pic:nvPicPr>
+                  <pic:blipFill>
+                    <a:blip r:embed="rId39"/>
+                    <a:stretch>
+                      <a:fillRect/>
+                    </a:stretch>
+                  </pic:blipFill>
+                  <pic:spPr bwMode="auto">
+                    <a:xfrm>
+                      <a:off x="0" y="0"/>
+                      <a:ext cx="5334000" cy="2096786"/>
+                    </a:xfrm>
+                    <a:prstGeom prst="rect">
+                      <a:avLst/>
+                    </a:prstGeom>
+                    <a:noFill/>
+                    <a:ln w="9525">
+                      <a:noFill/>
+                      <a:headEnd/>
+                      <a:tailEnd/>
+                    </a:ln>
+                  </pic:spPr>
+                </pic:pic>
+              </a:graphicData>
+            </a:graphic>
+          </wp:inline>
+        </w:drawing>
+      </w:r>
+    </w:p>
+    <w:p>
+      <w:pPr>
+        <w:pStyle w:val="ImageCaption"/>
+      </w:pPr>
+      <w:r>
         <w:t xml:space="preserve">Reper 5104900593, mediana niecek: niwelacja −50 mm, EGMS −52 mm</w:t>
       </w:r>
     </w:p>
-    <w:bookmarkEnd w:id="39"/>
-    <w:bookmarkStart w:id="43" w:name="Xd7e264cb1d269517b23178f31217f2f9ed96b37"/>
+    <w:bookmarkEnd w:id="42"/>
+    <w:bookmarkStart w:id="46" w:name="Xd7e264cb1d269517b23178f31217f2f9ed96b37"/>
     <w:p>
       <w:pPr>
         <w:pStyle w:val="Heading1"/>
@@ -2190,18 +2271,18 @@
           <wp:inline>
             <wp:extent cx="5334000" cy="2880741"/>
             <wp:effectExtent b="0" l="0" r="0" t="0"/>
-            <wp:docPr descr="Reper 4804901107: A — EGMS z linią wspólnego tempa grupy stabilnej, B — po odjęciu tego tempa, C — rozkład zmian EGMS na 307 reperach stabilnych z progiem N3" title="" id="41" name="Picture"/>
+            <wp:docPr descr="Reper 4804901107: A — EGMS z linią wspólnego tempa grupy stabilnej, B — po odjęciu tego tempa, C — rozkład zmian EGMS na 307 reperach stabilnych z progiem N3" title="" id="44" name="Picture"/>
             <a:graphic>
               <a:graphicData uri="http://schemas.openxmlformats.org/drawingml/2006/picture">
                 <pic:pic>
                   <pic:nvPicPr>
-                    <pic:cNvPr descr="/tmp/claude-0/-home-user-2-geoworldlook-egmscheck/adccf45a-26f6-515f-aa00-03d5d0c40b81/scratchpad/docimg2/nrw_reper_stabilny_4804901107.png" id="42" name="Picture"/>
+                    <pic:cNvPr descr="/tmp/claude-0/-home-user-2-geoworldlook-egmscheck/adccf45a-26f6-515f-aa00-03d5d0c40b81/scratchpad/docimg2/nrw_reper_stabilny_4804901107.png" id="45" name="Picture"/>
                     <pic:cNvPicPr>
                       <a:picLocks noChangeArrowheads="1" noChangeAspect="1"/>
                     </pic:cNvPicPr>
                   </pic:nvPicPr>
                   <pic:blipFill>
-                    <a:blip r:embed="rId40"/>
+                    <a:blip r:embed="rId43"/>
                     <a:stretch>
                       <a:fillRect/>
                     </a:stretch>
@@ -2280,8 +2361,8 @@
         <w:t xml:space="preserve">że przesunięcie jest wspólne dla wszystkich reperów stabilnych i mieści się w progu, to zmierzyliśmy. Że jego przyczyną jest różne „zero” układów odniesienia, to najbardziej prawdopodobne wyjaśnienie, ale go nie sprawdzaliśmy. Even i in. (2024) też go nie podają.</w:t>
       </w:r>
     </w:p>
-    <w:bookmarkEnd w:id="43"/>
-    <w:bookmarkStart w:id="44" w:name="Xfc3cf903a6ee5ebb8b3ca9e6e6a8aa8578f0c56"/>
+    <w:bookmarkEnd w:id="46"/>
+    <w:bookmarkStart w:id="47" w:name="Xfc3cf903a6ee5ebb8b3ca9e6e6a8aa8578f0c56"/>
     <w:p>
       <w:pPr>
         <w:pStyle w:val="Heading1"/>
@@ -2920,8 +3001,8 @@
         <w:t xml:space="preserve">Reper 5104900368 odstaje naprawdę. Sam EGMS oznacza tę komórkę jako zaszumioną: szum jest ok. 4 razy większy niż zwykle. Możliwa przyczyna to brzeg niecki, gdzie komórka 100 × 100 m uśrednia teren osiadający szybciej i wolniej; tego nie sprawdzaliśmy.</w:t>
       </w:r>
     </w:p>
-    <w:bookmarkEnd w:id="44"/>
-    <w:bookmarkStart w:id="45" w:name="wnioski"/>
+    <w:bookmarkEnd w:id="47"/>
+    <w:bookmarkStart w:id="48" w:name="wnioski"/>
     <w:p>
       <w:pPr>
         <w:pStyle w:val="Heading1"/>
@@ -3058,8 +3139,8 @@
         <w:t xml:space="preserve">EGMS dobrze pokazuje, gdzie i o ile teren osiada, przy ruchu od kilku mm/rok w górę. Przy ruchu poniżej ok. 2 mm/rok i przy wysokościach bezwzględnych potrzebny jest punkt odniesienia z ziemi. EGMS jest produktem archiwalnym, aktualizowanym raz w roku, i nie służy do wykrywania zdarzeń nagłych.</w:t>
       </w:r>
     </w:p>
-    <w:bookmarkEnd w:id="45"/>
-    <w:bookmarkStart w:id="46" w:name="ograniczenia-i-co-planujemy"/>
+    <w:bookmarkEnd w:id="48"/>
+    <w:bookmarkStart w:id="49" w:name="ograniczenia-i-co-planujemy"/>
     <w:p>
       <w:pPr>
         <w:pStyle w:val="Heading1"/>
@@ -3176,8 +3257,8 @@
         <w:t xml:space="preserve">Pokazać monitoring częstszy niż raz w roku: własne przetworzenie Sentinel-1 (ASF HyP3 i MintPy) co 12 dni dla 2024–2026, najpierw sprawdzone na okresie, który pokrywa EGMS.</w:t>
       </w:r>
     </w:p>
-    <w:bookmarkEnd w:id="46"/>
-    <w:bookmarkStart w:id="48" w:name="egms-w-praktyce-deutsche-bahn"/>
+    <w:bookmarkEnd w:id="49"/>
+    <w:bookmarkStart w:id="51" w:name="egms-w-praktyce-deutsche-bahn"/>
     <w:p>
       <w:pPr>
         <w:pStyle w:val="Heading1"/>
@@ -3193,7 +3274,7 @@
       <w:r>
         <w:t xml:space="preserve">DB InfraGO, spółka Deutsche Bahn odpowiedzialna za utrzymanie sieci (33 400 km torów), testuje EGMS jako warstwę wczesnego ostrzegania o niestabilności toru (</w:t>
       </w:r>
-      <w:hyperlink r:id="rId47">
+      <w:hyperlink r:id="rId50">
         <w:r>
           <w:rPr>
             <w:rStyle w:val="Hyperlink"/>
@@ -3395,8 +3476,8 @@
         <w:t xml:space="preserve">DB chce skrócić czas między pomiarem a danymi. To ten sam kierunek co nasz plan własnego przetwarzania Sentinel-1 co 12 dni.</w:t>
       </w:r>
     </w:p>
-    <w:bookmarkEnd w:id="48"/>
-    <w:bookmarkStart w:id="53" w:name="źródła-danych"/>
+    <w:bookmarkEnd w:id="51"/>
+    <w:bookmarkStart w:id="56" w:name="źródła-danych"/>
     <w:p>
       <w:pPr>
         <w:pStyle w:val="Heading1"/>
@@ -3413,7 +3494,7 @@
         </w:numPr>
         <w:pStyle w:val="Compact"/>
       </w:pPr>
-      <w:hyperlink r:id="rId49">
+      <w:hyperlink r:id="rId52">
         <w:r>
           <w:rPr>
             <w:rStyle w:val="Hyperlink"/>
@@ -3436,7 +3517,7 @@
         </w:numPr>
         <w:pStyle w:val="Compact"/>
       </w:pPr>
-      <w:hyperlink r:id="rId50">
+      <w:hyperlink r:id="rId53">
         <w:r>
           <w:rPr>
             <w:rStyle w:val="Hyperlink"/>
@@ -3465,7 +3546,7 @@
       <w:r>
         <w:t xml:space="preserve"> </w:t>
       </w:r>
-      <w:hyperlink r:id="rId51">
+      <w:hyperlink r:id="rId54">
         <w:r>
           <w:rPr>
             <w:rStyle w:val="Hyperlink"/>
@@ -3482,7 +3563,7 @@
       <w:r>
         <w:t xml:space="preserve"> </w:t>
       </w:r>
-      <w:hyperlink r:id="rId52">
+      <w:hyperlink r:id="rId55">
         <w:r>
           <w:rPr>
             <w:rStyle w:val="Hyperlink"/>
@@ -3505,7 +3586,7 @@
         </w:numPr>
         <w:pStyle w:val="Compact"/>
       </w:pPr>
-      <w:hyperlink r:id="rId47">
+      <w:hyperlink r:id="rId50">
         <w:r>
           <w:rPr>
             <w:rStyle w:val="Hyperlink"/>
@@ -3520,8 +3601,8 @@
         <w:t xml:space="preserve">— przypadek Deutsche Bahn</w:t>
       </w:r>
     </w:p>
-    <w:bookmarkEnd w:id="53"/>
-    <w:bookmarkStart w:id="59" w:name="literatura"/>
+    <w:bookmarkEnd w:id="56"/>
+    <w:bookmarkStart w:id="62" w:name="literatura"/>
     <w:p>
       <w:pPr>
         <w:pStyle w:val="Heading1"/>
@@ -3557,7 +3638,7 @@
       <w:r>
         <w:t xml:space="preserve"> </w:t>
       </w:r>
-      <w:hyperlink r:id="rId54">
+      <w:hyperlink r:id="rId57">
         <w:r>
           <w:rPr>
             <w:rStyle w:val="Hyperlink"/>
@@ -3593,7 +3674,7 @@
       <w:r>
         <w:t xml:space="preserve"> </w:t>
       </w:r>
-      <w:hyperlink r:id="rId55">
+      <w:hyperlink r:id="rId58">
         <w:r>
           <w:rPr>
             <w:rStyle w:val="Hyperlink"/>
@@ -3654,7 +3735,7 @@
       <w:r>
         <w:t xml:space="preserve"> </w:t>
       </w:r>
-      <w:hyperlink r:id="rId56">
+      <w:hyperlink r:id="rId59">
         <w:r>
           <w:rPr>
             <w:rStyle w:val="Hyperlink"/>
@@ -3690,7 +3771,7 @@
       <w:r>
         <w:t xml:space="preserve"> </w:t>
       </w:r>
-      <w:hyperlink r:id="rId57">
+      <w:hyperlink r:id="rId60">
         <w:r>
           <w:rPr>
             <w:rStyle w:val="Hyperlink"/>
@@ -3729,7 +3810,7 @@
       <w:r>
         <w:t xml:space="preserve"> </w:t>
       </w:r>
-      <w:hyperlink r:id="rId58">
+      <w:hyperlink r:id="rId61">
         <w:r>
           <w:rPr>
             <w:rStyle w:val="Hyperlink"/>
@@ -3738,7 +3819,7 @@
         </w:r>
       </w:hyperlink>
     </w:p>
-    <w:bookmarkEnd w:id="59"/>
+    <w:bookmarkEnd w:id="62"/>
     <w:sectPr/>
   </w:body>
 </w:document>

</xml_diff>

<commit_message>
docs(report): shorter impersonal meeting report based on author's edits
Co-Authored-By: Claude Opus 5.5 <noreply@anthropic.com>
Claude-Session: https://claude.ai/code/session_01PT88ya4kvSxXN1gjfrDKxd
</commit_message>
<xml_diff>
--- a/docs/raport/EGMS_raport_spotkanie_2026-10-16.docx
+++ b/docs/raport/EGMS_raport_spotkanie_2026-10-16.docx
@@ -7,45 +7,45 @@
         <w:pStyle w:val="Title"/>
       </w:pPr>
       <w:r>
-        <w:t xml:space="preserve">Wyniki:</w:t>
+        <w:t xml:space="preserve">EGMS</w:t>
       </w:r>
       <w:r>
         <w:t xml:space="preserve"> </w:t>
       </w:r>
       <w:r>
-        <w:t xml:space="preserve">EGMS</w:t>
+        <w:t xml:space="preserve">kontra</w:t>
       </w:r>
       <w:r>
         <w:t xml:space="preserve"> </w:t>
       </w:r>
       <w:r>
-        <w:t xml:space="preserve">kontra</w:t>
+        <w:t xml:space="preserve">pomiar</w:t>
       </w:r>
       <w:r>
         <w:t xml:space="preserve"> </w:t>
       </w:r>
       <w:r>
-        <w:t xml:space="preserve">pomiar</w:t>
+        <w:t xml:space="preserve">naziemny</w:t>
+      </w:r>
+    </w:p>
+    <w:p>
+      <w:pPr>
+        <w:pStyle w:val="Subtitle"/>
+      </w:pPr>
+      <w:r>
+        <w:t xml:space="preserve">Raport</w:t>
       </w:r>
       <w:r>
         <w:t xml:space="preserve"> </w:t>
       </w:r>
       <w:r>
-        <w:t xml:space="preserve">naziemny</w:t>
-      </w:r>
-    </w:p>
-    <w:p>
-      <w:pPr>
-        <w:pStyle w:val="Author"/>
-      </w:pPr>
-      <w:r>
-        <w:t xml:space="preserve">Dawid</w:t>
+        <w:t xml:space="preserve">na</w:t>
       </w:r>
       <w:r>
         <w:t xml:space="preserve"> </w:t>
       </w:r>
       <w:r>
-        <w:t xml:space="preserve">Sajewski</w:t>
+        <w:t xml:space="preserve">spotkanie</w:t>
       </w:r>
     </w:p>
     <w:p>
@@ -79,11 +79,53 @@
         </w:rPr>
         <w:t xml:space="preserve">W skrócie:</w:t>
       </w:r>
-      <w:r>
-        <w:t xml:space="preserve"> </w:t>
-      </w:r>
-      <w:r>
-        <w:t xml:space="preserve">niwelacja, która nie korzysta z GNSS, potwierdza osiadanie widoczne w EGMS. Niecki zgadzają się co do miejsca, kierunku ruchu (100% reperów w nieckach) i skali (do −140 mm w 3 lata). EGMS ma stałe przesunięcie ok. −1,2 mm/rok względem niwelacji, a deklarowany przez niego szum jest ok. 2 razy mniejszy niż faktyczna różnica, dlatego do małych ruchów potrzebny jest punkt odniesienia z ziemi.</w:t>
+    </w:p>
+    <w:p>
+      <w:pPr>
+        <w:numPr>
+          <w:ilvl w:val="0"/>
+          <w:numId w:val="1001"/>
+        </w:numPr>
+        <w:pStyle w:val="Compact"/>
+      </w:pPr>
+      <w:r>
+        <w:t xml:space="preserve">Niwelacja, niezależna od GNSS, potwierdza osiadanie widoczne w EGMS.</w:t>
+      </w:r>
+    </w:p>
+    <w:p>
+      <w:pPr>
+        <w:numPr>
+          <w:ilvl w:val="0"/>
+          <w:numId w:val="1001"/>
+        </w:numPr>
+        <w:pStyle w:val="Compact"/>
+      </w:pPr>
+      <w:r>
+        <w:t xml:space="preserve">Niecki zgadzają się co do miejsca, kierunku ruchu (100% reperów w nieckach) i skali (do −140 mm w 3 lata).</w:t>
+      </w:r>
+    </w:p>
+    <w:p>
+      <w:pPr>
+        <w:numPr>
+          <w:ilvl w:val="0"/>
+          <w:numId w:val="1001"/>
+        </w:numPr>
+        <w:pStyle w:val="Compact"/>
+      </w:pPr>
+      <w:r>
+        <w:t xml:space="preserve">EGMS ma stałe przesunięcie −1,22 mm/rok względem niwelacji.</w:t>
+      </w:r>
+    </w:p>
+    <w:p>
+      <w:pPr>
+        <w:numPr>
+          <w:ilvl w:val="0"/>
+          <w:numId w:val="1001"/>
+        </w:numPr>
+        <w:pStyle w:val="Compact"/>
+      </w:pPr>
+      <w:r>
+        <w:t xml:space="preserve">Faktyczna różnica EGMS–niwelacja jest ok. 2 razy większa niż szum deklarowany w plikach EGMS.</w:t>
       </w:r>
     </w:p>
     <w:bookmarkStart w:id="20" w:name="cel"/>
@@ -100,25 +142,17 @@
         <w:pStyle w:val="FirstParagraph"/>
       </w:pPr>
       <w:r>
-        <w:t xml:space="preserve">Chcemy sprawdzić, czy European Ground Motion Service (EGMS) pokazuje ten sam ruch terenu co pomiary naziemne. Porównujemy go z dwoma niezależnymi źródłami: stacjami GNSS i niwelacją precyzyjną. Wszystkie dane są otwarte, a progi oceny ustaliliśmy przed obliczeniami i nie zmienialiśmy ich po zobaczeniu wyników.</w:t>
+        <w:t xml:space="preserve">Sprawdzono, czy European Ground Motion Service (EGMS) pokazuje ten sam ruch terenu co pomiary naziemne. EGMS porównano z dwoma niezależnymi źródłami: stacjami GNSS i niwelacją precyzyjną. Progi oceny ustalono przed obliczeniami.</w:t>
       </w:r>
     </w:p>
     <w:bookmarkEnd w:id="20"/>
-    <w:bookmarkStart w:id="21" w:name="eksperyment"/>
+    <w:bookmarkStart w:id="21" w:name="dane-wejściowe"/>
     <w:p>
       <w:pPr>
         <w:pStyle w:val="Heading1"/>
       </w:pPr>
       <w:r>
-        <w:t xml:space="preserve">Eksperyment</w:t>
-      </w:r>
-    </w:p>
-    <w:p>
-      <w:pPr>
-        <w:pStyle w:val="FirstParagraph"/>
-      </w:pPr>
-      <w:r>
-        <w:t xml:space="preserve">Zrobiliśmy dwa niezależne sprawdzenia. Przypadki wybraliśmy tak, żeby był duży, dobrze opisany ruch terenu, otwarte dane naziemne i publikacja, z którą można porównać wynik.</w:t>
+        <w:t xml:space="preserve">Dane wejściowe</w:t>
       </w:r>
     </w:p>
     <w:tbl>
@@ -164,7 +198,7 @@
               <w:rPr>
                 <w:b/>
               </w:rPr>
-              <w:t xml:space="preserve">1. GNSS — Groningen (Holandia)</w:t>
+              <w:t xml:space="preserve">GNSS — Groningen (Holandia)</w:t>
             </w:r>
           </w:p>
         </w:tc>
@@ -179,7 +213,7 @@
               <w:rPr>
                 <w:b/>
               </w:rPr>
-              <w:t xml:space="preserve">2. Niwelacja — zachodnia NRW (Niemcy)</w:t>
+              <w:t xml:space="preserve">Niwelacja — zachodnia NRW (Niemcy)</w:t>
             </w:r>
           </w:p>
         </w:tc>
@@ -193,7 +227,7 @@
               <w:jc w:val="left"/>
             </w:pPr>
             <w:r>
-              <w:t xml:space="preserve">Co się dzieje z terenem</w:t>
+              <w:t xml:space="preserve">Ruch terenu</w:t>
             </w:r>
           </w:p>
         </w:tc>
@@ -217,7 +251,7 @@
               <w:jc w:val="left"/>
             </w:pPr>
             <w:r>
-              <w:t xml:space="preserve">niecki osiadania wokół odkrywek węgla brunatnego (obniżanie wód gruntowych)</w:t>
+              <w:t xml:space="preserve">niecki osiadania wokół odkrywek węgla brunatnego</w:t>
             </w:r>
           </w:p>
         </w:tc>
@@ -243,19 +277,19 @@
               <w:jc w:val="left"/>
             </w:pPr>
             <w:r>
-              <w:t xml:space="preserve">35 stacji GNSS (27 osiadających, 8 stabilnych), dobowe pozycje</w:t>
-            </w:r>
-          </w:p>
-        </w:tc>
-        <w:tc>
-          <w:tcPr/>
-          <w:p>
-            <w:pPr>
-              <w:pStyle w:val="Compact"/>
-              <w:jc w:val="left"/>
-            </w:pPr>
-            <w:r>
-              <w:t xml:space="preserve">1216 reperów z dwoma pomiarami: zwykle maj 2019 i maj 2022</w:t>
+              <w:t xml:space="preserve">35 stacji GNSS (27 osiadających, 8 stabilnych), pozycje dobowe</w:t>
+            </w:r>
+          </w:p>
+        </w:tc>
+        <w:tc>
+          <w:tcPr/>
+          <w:p>
+            <w:pPr>
+              <w:pStyle w:val="Compact"/>
+              <w:jc w:val="left"/>
+            </w:pPr>
+            <w:r>
+              <w:t xml:space="preserve">1216 reperów z dwoma pomiarami (zwykle 05.2019 i 05.2022)</w:t>
             </w:r>
           </w:p>
         </w:tc>
@@ -281,19 +315,19 @@
               <w:jc w:val="left"/>
             </w:pPr>
             <w:r>
-              <w:t xml:space="preserve">L2b Calibrated, wydanie 2020–2024, ruch w kierunku satelity</w:t>
-            </w:r>
-          </w:p>
-        </w:tc>
-        <w:tc>
-          <w:tcPr/>
-          <w:p>
-            <w:pPr>
-              <w:pStyle w:val="Compact"/>
-              <w:jc w:val="left"/>
-            </w:pPr>
-            <w:r>
-              <w:t xml:space="preserve">L3 Ortho, wydanie 2019–2023, ruch pionowy w komórkach 100 × 100 m</w:t>
+              <w:t xml:space="preserve">L2b Calibrated 2020–2024, ruch w kierunku satelity</w:t>
+            </w:r>
+          </w:p>
+        </w:tc>
+        <w:tc>
+          <w:tcPr/>
+          <w:p>
+            <w:pPr>
+              <w:pStyle w:val="Compact"/>
+              <w:jc w:val="left"/>
+            </w:pPr>
+            <w:r>
+              <w:t xml:space="preserve">L3 Ortho 2019–2023, ruch pionowy, komórki 100 × 100 m</w:t>
             </w:r>
           </w:p>
         </w:tc>
@@ -307,7 +341,7 @@
               <w:jc w:val="left"/>
             </w:pPr>
             <w:r>
-              <w:t xml:space="preserve">Co porównujemy</w:t>
+              <w:t xml:space="preserve">Porównywana wielkość</w:t>
             </w:r>
           </w:p>
         </w:tc>
@@ -331,7 +365,7 @@
               <w:jc w:val="left"/>
             </w:pPr>
             <w:r>
-              <w:t xml:space="preserve">zmianę wysokości [mm] między tymi samymi dniami</w:t>
+              <w:t xml:space="preserve">zmiana wysokości [mm] między tymi samymi dniami</w:t>
             </w:r>
           </w:p>
         </w:tc>
@@ -345,31 +379,31 @@
               <w:jc w:val="left"/>
             </w:pPr>
             <w:r>
-              <w:t xml:space="preserve">Dlaczego ten przypadek</w:t>
-            </w:r>
-          </w:p>
-        </w:tc>
-        <w:tc>
-          <w:tcPr/>
-          <w:p>
-            <w:pPr>
-              <w:pStyle w:val="Compact"/>
-              <w:jc w:val="left"/>
-            </w:pPr>
-            <w:r>
-              <w:t xml:space="preserve">metoda porównania EGMS z GNSS jest opisana w oficjalnym raporcie walidacyjnym EGMS (Koudogbo i in., 2025); próg 1,5 mm/rok jak w pracy o delcie Padu (Fabris i Nazari, 2026)</w:t>
-            </w:r>
-          </w:p>
-        </w:tc>
-        <w:tc>
-          <w:tcPr/>
-          <w:p>
-            <w:pPr>
-              <w:pStyle w:val="Compact"/>
-              <w:jc w:val="left"/>
-            </w:pPr>
-            <w:r>
-              <w:t xml:space="preserve">Even i in. (2024) porównali EGMS z niwelacją w tym samym regionie, więc mamy z czym zestawić wynik; rejestr wysokości NRW jest otwarty i ma historię pomiarów</w:t>
+              <w:t xml:space="preserve">Publikacja odniesienia</w:t>
+            </w:r>
+          </w:p>
+        </w:tc>
+        <w:tc>
+          <w:tcPr/>
+          <w:p>
+            <w:pPr>
+              <w:pStyle w:val="Compact"/>
+              <w:jc w:val="left"/>
+            </w:pPr>
+            <w:r>
+              <w:t xml:space="preserve">Koudogbo i in. (2025); Fabris i Nazari (2026)</w:t>
+            </w:r>
+          </w:p>
+        </w:tc>
+        <w:tc>
+          <w:tcPr/>
+          <w:p>
+            <w:pPr>
+              <w:pStyle w:val="Compact"/>
+              <w:jc w:val="left"/>
+            </w:pPr>
+            <w:r>
+              <w:t xml:space="preserve">Even i in. (2024) — ten sam region</w:t>
             </w:r>
           </w:p>
         </w:tc>
@@ -395,69 +429,39 @@
               <w:jc w:val="left"/>
             </w:pPr>
             <w:r>
-              <w:t xml:space="preserve">częściowa: EGMS jest kalibrowany modelem GNSS</w:t>
-            </w:r>
-          </w:p>
-        </w:tc>
-        <w:tc>
-          <w:tcPr/>
-          <w:p>
-            <w:pPr>
-              <w:pStyle w:val="Compact"/>
-              <w:jc w:val="left"/>
-            </w:pPr>
-            <w:r>
-              <w:t xml:space="preserve">pełna: niwelacja nie korzysta z GNSS</w:t>
+              <w:t xml:space="preserve">częściowa (EGMS kalibrowany modelem GNSS)</w:t>
+            </w:r>
+          </w:p>
+        </w:tc>
+        <w:tc>
+          <w:tcPr/>
+          <w:p>
+            <w:pPr>
+              <w:pStyle w:val="Compact"/>
+              <w:jc w:val="left"/>
+            </w:pPr>
+            <w:r>
+              <w:t xml:space="preserve">pełna</w:t>
             </w:r>
           </w:p>
         </w:tc>
       </w:tr>
     </w:tbl>
-    <w:p>
-      <w:pPr>
-        <w:pStyle w:val="BodyText"/>
-      </w:pPr>
-      <w:r>
-        <w:t xml:space="preserve">Drugie sprawdzenie jest ważniejsze. Jeśli EGMS zgadza się z niwelacją, to nie dlatego, że został do niej dopasowany.</w:t>
-      </w:r>
-    </w:p>
     <w:bookmarkEnd w:id="21"/>
-    <w:bookmarkStart w:id="22" w:name="jak-liczyliśmy"/>
+    <w:bookmarkStart w:id="22" w:name="metoda"/>
     <w:p>
       <w:pPr>
         <w:pStyle w:val="Heading1"/>
       </w:pPr>
       <w:r>
-        <w:t xml:space="preserve">Jak liczyliśmy</w:t>
+        <w:t xml:space="preserve">Metoda</w:t>
       </w:r>
     </w:p>
     <w:p>
       <w:pPr>
         <w:numPr>
           <w:ilvl w:val="0"/>
-          <w:numId w:val="1001"/>
-        </w:numPr>
-        <w:pStyle w:val="Compact"/>
-      </w:pPr>
-      <w:r>
-        <w:rPr>
-          <w:bCs/>
-          <w:b/>
-        </w:rPr>
-        <w:t xml:space="preserve">Dane.</w:t>
-      </w:r>
-      <w:r>
-        <w:t xml:space="preserve"> </w:t>
-      </w:r>
-      <w:r>
-        <w:t xml:space="preserve">EGMS pobieramy przez API Copernicusa, GNSS z Nevada Geodetic Laboratory, niwelację z rejestru Geobasis NRW. Każdy plik ma zapisane źródło, datę pobrania i sumę kontrolną.</w:t>
-      </w:r>
-    </w:p>
-    <w:p>
-      <w:pPr>
-        <w:numPr>
-          <w:ilvl w:val="0"/>
-          <w:numId w:val="1001"/>
+          <w:numId w:val="1002"/>
         </w:numPr>
         <w:pStyle w:val="Compact"/>
       </w:pPr>
@@ -472,14 +476,14 @@
         <w:t xml:space="preserve"> </w:t>
       </w:r>
       <w:r>
-        <w:t xml:space="preserve">punkty EGMS w promieniu 100 m od stacji (co najmniej 3). Ruch GNSS przeliczamy na kierunek patrzenia satelity, bo tylko taki ruch widzi EGMS. Do obu szeregów dopasowujemy ten sam model (trend i sinusoida roczna).</w:t>
+        <w:t xml:space="preserve">punkty EGMS w promieniu 100 m od stacji (min. 3); ruch GNSS przeliczony na kierunek patrzenia satelity; dla obu szeregów ten sam model (trend i sinusoida roczna).</w:t>
       </w:r>
     </w:p>
     <w:p>
       <w:pPr>
         <w:numPr>
           <w:ilvl w:val="0"/>
-          <w:numId w:val="1001"/>
+          <w:numId w:val="1002"/>
         </w:numPr>
         <w:pStyle w:val="Compact"/>
       </w:pPr>
@@ -494,14 +498,14 @@
         <w:t xml:space="preserve"> </w:t>
       </w:r>
       <w:r>
-        <w:t xml:space="preserve">bierzemy każdy reper z dwoma pomiarami w oknie EGMS, odległymi o co najmniej rok, i komórkę EGMS, w której leży. Wysokość EGMS w dniu pomiaru odczytujemy z dwóch sąsiednich dat. Porównujemy zmianę wysokości między tymi samymi dniami.</w:t>
+        <w:t xml:space="preserve">każdy reper z dwoma pomiarami w oknie EGMS (odstęp min. 1 rok) i komórka EGMS, w której leży; porównano zmianę wysokości między tymi samymi dniami.</w:t>
       </w:r>
     </w:p>
     <w:p>
       <w:pPr>
         <w:numPr>
           <w:ilvl w:val="0"/>
-          <w:numId w:val="1001"/>
+          <w:numId w:val="1002"/>
         </w:numPr>
         <w:pStyle w:val="Compact"/>
       </w:pPr>
@@ -516,14 +520,14 @@
         <w:t xml:space="preserve"> </w:t>
       </w:r>
       <w:r>
-        <w:t xml:space="preserve">kryteria K1–K3 (GNSS) i N1–N4 (niwelacja) z progami z literatury, zatwierdzone 12.10.2026 przed obliczeniami.</w:t>
+        <w:t xml:space="preserve">kryteria K1–K3 (GNSS) i N1–N4 (niwelacja), progi zatwierdzone 12.10.2026 przed obliczeniami.</w:t>
       </w:r>
     </w:p>
     <w:p>
       <w:pPr>
         <w:numPr>
           <w:ilvl w:val="0"/>
-          <w:numId w:val="1001"/>
+          <w:numId w:val="1002"/>
         </w:numPr>
         <w:pStyle w:val="Compact"/>
       </w:pPr>
@@ -532,202 +536,23 @@
           <w:bCs/>
           <w:b/>
         </w:rPr>
-        <w:t xml:space="preserve">Wariant względny (dodatkowy):</w:t>
+        <w:t xml:space="preserve">Wariant względny:</w:t>
       </w:r>
       <w:r>
         <w:t xml:space="preserve"> </w:t>
       </w:r>
       <w:r>
-        <w:t xml:space="preserve">oba pomiary liczymy względem 307 reperów, które według niwelacji się nie ruszają. To usuwa wspólne „zero”. Dodaliśmy go po obejrzeniu wyniku głównego, więc nie zmienia werdyktu.</w:t>
-      </w:r>
-    </w:p>
-    <w:p>
-      <w:pPr>
-        <w:pStyle w:val="FirstParagraph"/>
-      </w:pPr>
-      <w:r>
-        <w:t xml:space="preserve">Fragment notatnika</w:t>
-      </w:r>
-      <w:r>
-        <w:t xml:space="preserve"> </w:t>
-      </w:r>
-      <w:r>
-        <w:rPr>
-          <w:iCs/>
-          <w:i/>
-        </w:rPr>
-        <w:t xml:space="preserve">EGMS_Monitoring.ipynb</w:t>
-      </w:r>
-      <w:r>
-        <w:t xml:space="preserve"> </w:t>
-      </w:r>
-      <w:r>
-        <w:t xml:space="preserve">(sekcja „Niwelacja na wydaniu 2019–2023”):</w:t>
-      </w:r>
-    </w:p>
-    <w:p>
-      <w:pPr>
-        <w:pStyle w:val="SourceCode"/>
-      </w:pPr>
-      <w:r>
-        <w:rPr>
-          <w:rStyle w:val="NormalTok"/>
-        </w:rPr>
-        <w:t xml:space="preserve">run_task(rt, </w:t>
-      </w:r>
-      <w:r>
-        <w:rPr>
-          <w:rStyle w:val="StringTok"/>
-        </w:rPr>
-        <w:t xml:space="preserve">'levelling_egms_download_nrw_west'</w:t>
-      </w:r>
-      <w:r>
-        <w:rPr>
-          <w:rStyle w:val="NormalTok"/>
-        </w:rPr>
-        <w:t xml:space="preserve">, task_levelling_egms_download, rt, cfg, </w:t>
-      </w:r>
-      <w:r>
-        <w:rPr>
-          <w:rStyle w:val="StringTok"/>
-        </w:rPr>
-        <w:t xml:space="preserve">'nrw_west'</w:t>
-      </w:r>
-      <w:r>
-        <w:rPr>
-          <w:rStyle w:val="NormalTok"/>
-        </w:rPr>
-        <w:t xml:space="preserve">, CONFIRM_MB_NRW_WEST_LEVELLING)</w:t>
-      </w:r>
-      <w:r>
-        <w:br/>
-      </w:r>
-      <w:r>
-        <w:rPr>
-          <w:rStyle w:val="NormalTok"/>
-        </w:rPr>
-        <w:t xml:space="preserve">run_task(rt, </w:t>
-      </w:r>
-      <w:r>
-        <w:rPr>
-          <w:rStyle w:val="StringTok"/>
-        </w:rPr>
-        <w:t xml:space="preserve">'levelling_extract_nrw_west'</w:t>
-      </w:r>
-      <w:r>
-        <w:rPr>
-          <w:rStyle w:val="NormalTok"/>
-        </w:rPr>
-        <w:t xml:space="preserve">, task_levelling_extract, rt, cfg, </w:t>
-      </w:r>
-      <w:r>
-        <w:rPr>
-          <w:rStyle w:val="StringTok"/>
-        </w:rPr>
-        <w:t xml:space="preserve">'nrw_west'</w:t>
-      </w:r>
-      <w:r>
-        <w:rPr>
-          <w:rStyle w:val="NormalTok"/>
-        </w:rPr>
-        <w:t xml:space="preserve">)</w:t>
-      </w:r>
-      <w:r>
-        <w:br/>
-      </w:r>
-      <w:r>
-        <w:rPr>
-          <w:rStyle w:val="NormalTok"/>
-        </w:rPr>
-        <w:t xml:space="preserve">run_task(rt, </w:t>
-      </w:r>
-      <w:r>
-        <w:rPr>
-          <w:rStyle w:val="StringTok"/>
-        </w:rPr>
-        <w:t xml:space="preserve">'compare_levelling_check_nrw_west'</w:t>
-      </w:r>
-      <w:r>
-        <w:rPr>
-          <w:rStyle w:val="NormalTok"/>
-        </w:rPr>
-        <w:t xml:space="preserve">, task_compare_levelling_check, rt, cfg, </w:t>
-      </w:r>
-      <w:r>
-        <w:rPr>
-          <w:rStyle w:val="StringTok"/>
-        </w:rPr>
-        <w:t xml:space="preserve">'nrw_west'</w:t>
-      </w:r>
-      <w:r>
-        <w:rPr>
-          <w:rStyle w:val="NormalTok"/>
-        </w:rPr>
-        <w:t xml:space="preserve">)</w:t>
-      </w:r>
-    </w:p>
-    <w:p>
-      <w:pPr>
-        <w:pStyle w:val="SourceCode"/>
-      </w:pPr>
-      <w:r>
-        <w:rPr>
-          <w:rStyle w:val="VerbatimChar"/>
-        </w:rPr>
-        <w:t xml:space="preserve">[SKIPPED] levelling_egms_download_nrw_west (0.0 s) wszystkie 4 pliki z planu są na Dysku i w manifeście</w:t>
-      </w:r>
-      <w:r>
-        <w:br/>
-      </w:r>
-      <w:r>
-        <w:rPr>
-          <w:rStyle w:val="VerbatimChar"/>
-        </w:rPr>
-        <w:t xml:space="preserve">[OK] levelling_extract_nrw_west (44.3 s) mapa L3 2019-2023: 201663 komórek</w:t>
-      </w:r>
-      <w:r>
-        <w:br/>
-      </w:r>
-      <w:r>
-        <w:rPr>
-          <w:rStyle w:val="VerbatimChar"/>
-        </w:rPr>
-        <w:t xml:space="preserve">Epoki w oknie 2019-01-07 - 2023-12-18: 1491 z 13476 reperów ze statusem 'ok'</w:t>
-      </w:r>
-      <w:r>
-        <w:br/>
-      </w:r>
-      <w:r>
-        <w:rPr>
-          <w:rStyle w:val="VerbatimChar"/>
-        </w:rPr>
-        <w:t xml:space="preserve">Porównanie z niwelacją (absolute): 1216 z 13476 reperów ze statusem 'ok'</w:t>
-      </w:r>
-    </w:p>
-    <w:p>
-      <w:pPr>
-        <w:pStyle w:val="FirstParagraph"/>
-      </w:pPr>
-      <w:r>
-        <w:t xml:space="preserve">Z 13 476 reperów w obszarze 1491 ma dwa pomiary w oknie EGMS, a 1216 z nich leży w komórce EGMS z danymi.</w:t>
+        <w:t xml:space="preserve">oba pomiary liczone względem 307 reperów stabilnych według niwelacji (usuwa wspólne „zero”); wariant dodatkowy, werdykt główny bez zmian.</w:t>
       </w:r>
     </w:p>
     <w:bookmarkEnd w:id="22"/>
-    <w:bookmarkStart w:id="29" w:name="Xb3db16b1eba88ebb1942668ccdf71336c184e41"/>
+    <w:bookmarkStart w:id="29" w:name="wynik-1-gnss-groningen"/>
     <w:p>
       <w:pPr>
         <w:pStyle w:val="Heading1"/>
       </w:pPr>
       <w:r>
-        <w:t xml:space="preserve">Wynik 1: GNSS w Groningen — zgodność częściowa</w:t>
-      </w:r>
-    </w:p>
-    <w:p>
-      <w:pPr>
-        <w:pStyle w:val="FirstParagraph"/>
-      </w:pPr>
-      <w:r>
-        <w:t xml:space="preserve">Tempo osiadania z EGMS zgadza się z GNSS w 99% par stacja–ścieżka. Nie przeszła kontrola na stacjach stabilnych, o 0,12 mm/rok na jednej stacji, więc wynik formalny to zgodność częściowa.</w:t>
+        <w:t xml:space="preserve">Wynik 1: GNSS — Groningen</w:t>
       </w:r>
     </w:p>
     <w:tbl>
@@ -825,7 +650,7 @@
               <w:jc w:val="left"/>
             </w:pPr>
             <w:r>
-              <w:t xml:space="preserve">K1: czy tempo osiadania się zgadza?</w:t>
+              <w:t xml:space="preserve">K1: zgodność tempa osiadania</w:t>
             </w:r>
           </w:p>
         </w:tc>
@@ -861,7 +686,7 @@
               <w:jc w:val="left"/>
             </w:pPr>
             <w:r>
-              <w:t xml:space="preserve">✔ tak</w:t>
+              <w:t xml:space="preserve">✔</w:t>
             </w:r>
           </w:p>
         </w:tc>
@@ -875,7 +700,7 @@
               <w:jc w:val="left"/>
             </w:pPr>
             <w:r>
-              <w:t xml:space="preserve">K2: czy szeregi w czasie się zgadzają?</w:t>
+              <w:t xml:space="preserve">K2: zgodność szeregów w czasie</w:t>
             </w:r>
           </w:p>
         </w:tc>
@@ -911,7 +736,7 @@
               <w:jc w:val="left"/>
             </w:pPr>
             <w:r>
-              <w:t xml:space="preserve">✔ tak</w:t>
+              <w:t xml:space="preserve">✔</w:t>
             </w:r>
           </w:p>
         </w:tc>
@@ -925,7 +750,7 @@
               <w:jc w:val="left"/>
             </w:pPr>
             <w:r>
-              <w:t xml:space="preserve">K3: czy na stacjach stabilnych EGMS nie pokazuje ruchu, którego nie ma?</w:t>
+              <w:t xml:space="preserve">K3: stacje stabilne</w:t>
             </w:r>
           </w:p>
         </w:tc>
@@ -961,7 +786,7 @@
               <w:jc w:val="left"/>
             </w:pPr>
             <w:r>
-              <w:t xml:space="preserve">✘ nie</w:t>
+              <w:t xml:space="preserve">✘</w:t>
             </w:r>
           </w:p>
         </w:tc>
@@ -969,19 +794,27 @@
     </w:tbl>
     <w:p>
       <w:pPr>
+        <w:pStyle w:val="BodyText"/>
+      </w:pPr>
+      <w:r>
+        <w:t xml:space="preserve">Wynik formalny: zgodność częściowa (K3 przekroczone o 0,12 mm/rok na jednej stacji).</w:t>
+      </w:r>
+    </w:p>
+    <w:p>
+      <w:pPr>
         <w:pStyle w:val="CaptionedFigure"/>
       </w:pPr>
       <w:r>
         <w:drawing>
           <wp:inline>
-            <wp:extent cx="4679999" cy="4384816"/>
+            <wp:extent cx="4319999" cy="4047522"/>
             <wp:effectExtent b="0" l="0" r="0" t="0"/>
-            <wp:docPr descr="EGMS kontra GNSS w Groningen: każdy punkt to stacja widziana z jednej ścieżki satelity, linia 1:1, szary pas ±1,5 mm/rok" title="" id="24" name="Picture"/>
+            <wp:docPr descr="EGMS kontra GNSS w Groningen: punkt = stacja widziana z jednej ścieżki satelity, linia 1:1, szary pas ±1,5 mm/rok" title="" id="24" name="Picture"/>
             <a:graphic>
               <a:graphicData uri="http://schemas.openxmlformats.org/drawingml/2006/picture">
                 <pic:pic>
                   <pic:nvPicPr>
-                    <pic:cNvPr descr="/tmp/claude-0/-home-user-2-geoworldlook-egmscheck/adccf45a-26f6-515f-aa00-03d5d0c40b81/scratchpad/docimg2/groningen_gnss_scatter.png" id="25" name="Picture"/>
+                    <pic:cNvPr descr="/tmp/claude-0/-home-user-2-geoworldlook-egmscheck/adccf45a-26f6-515f-aa00-03d5d0c40b81/scratchpad/userdoc/media/media/image1.png" id="25" name="Picture"/>
                     <pic:cNvPicPr>
                       <a:picLocks noChangeArrowheads="1" noChangeAspect="1"/>
                     </pic:cNvPicPr>
@@ -995,7 +828,7 @@
                   <pic:spPr bwMode="auto">
                     <a:xfrm>
                       <a:off x="0" y="0"/>
-                      <a:ext cx="4679999" cy="4384816"/>
+                      <a:ext cx="4319999" cy="4047522"/>
                     </a:xfrm>
                     <a:prstGeom prst="rect">
                       <a:avLst/>
@@ -1019,33 +852,7 @@
         <w:pStyle w:val="ImageCaption"/>
       </w:pPr>
       <w:r>
-        <w:t xml:space="preserve">EGMS kontra GNSS w Groningen: każdy punkt to stacja widziana z jednej ścieżki satelity, linia 1:1, szary pas ±1,5 mm/rok</w:t>
-      </w:r>
-    </w:p>
-    <w:p>
-      <w:pPr>
-        <w:pStyle w:val="BodyText"/>
-      </w:pPr>
-      <w:r>
-        <w:t xml:space="preserve">Punkty ze ścieżek wznoszących leżą nieco nad linią 1:1, a ze zstępujących nieco pod nią (ok. 0,5–1 mm/rok, w granicach progu). Może to być mała różnica ruchu poziomego wschód–zachód między GNSS a EGMS; nie badaliśmy tego osobno.</w:t>
-      </w:r>
-    </w:p>
-    <w:p>
-      <w:pPr>
-        <w:pStyle w:val="BodyText"/>
-      </w:pPr>
-      <w:r>
-        <w:rPr>
-          <w:bCs/>
-          <w:b/>
-        </w:rPr>
-        <w:t xml:space="preserve">Przykładowa stacja w czasie: AME1.</w:t>
-      </w:r>
-      <w:r>
-        <w:t xml:space="preserve"> </w:t>
-      </w:r>
-      <w:r>
-        <w:t xml:space="preserve">Każdy panel to jedna ścieżka satelity (ruch w kierunku satelity, LOS) albo ruch pionowy (U). Niebieska linia to EGMS, pomarańczowe kropki to dobowe pozycje GNSS przeliczone na ten sam kierunek.</w:t>
+        <w:t xml:space="preserve">EGMS kontra GNSS w Groningen: punkt = stacja widziana z jednej ścieżki satelity, linia 1:1, szary pas ±1,5 mm/rok</w:t>
       </w:r>
     </w:p>
     <w:p>
@@ -1055,14 +862,14 @@
       <w:r>
         <w:drawing>
           <wp:inline>
-            <wp:extent cx="5334000" cy="8919732"/>
+            <wp:extent cx="4679999" cy="7826086"/>
             <wp:effectExtent b="0" l="0" r="0" t="0"/>
-            <wp:docPr descr="Stacja AME1, Groningen 2020–2024: EGMS (niebieska linia) i dobowe GNSS (pomarańczowe kropki) na czterech ścieżkach satelity i w pionie" title="" id="27" name="Picture"/>
+            <wp:docPr descr="Stacja AME1, 2020–2024: EGMS (niebieska linia) i dobowe GNSS (pomarańczowe kropki) na czterech ścieżkach satelity i w pionie" title="" id="27" name="Picture"/>
             <a:graphic>
               <a:graphicData uri="http://schemas.openxmlformats.org/drawingml/2006/picture">
                 <pic:pic>
                   <pic:nvPicPr>
-                    <pic:cNvPr descr="/tmp/claude-0/-home-user-2-geoworldlook-egmscheck/adccf45a-26f6-515f-aa00-03d5d0c40b81/scratchpad/docimg2/groningen_AME1_szeregi.png" id="28" name="Picture"/>
+                    <pic:cNvPr descr="/tmp/claude-0/-home-user-2-geoworldlook-egmscheck/adccf45a-26f6-515f-aa00-03d5d0c40b81/scratchpad/userdoc/media/media/image2.png" id="28" name="Picture"/>
                     <pic:cNvPicPr>
                       <a:picLocks noChangeArrowheads="1" noChangeAspect="1"/>
                     </pic:cNvPicPr>
@@ -1076,7 +883,7 @@
                   <pic:spPr bwMode="auto">
                     <a:xfrm>
                       <a:off x="0" y="0"/>
-                      <a:ext cx="5334000" cy="8919732"/>
+                      <a:ext cx="4679999" cy="7826086"/>
                     </a:xfrm>
                     <a:prstGeom prst="rect">
                       <a:avLst/>
@@ -1100,7 +907,7 @@
         <w:pStyle w:val="ImageCaption"/>
       </w:pPr>
       <w:r>
-        <w:t xml:space="preserve">Stacja AME1, Groningen 2020–2024: EGMS (niebieska linia) i dobowe GNSS (pomarańczowe kropki) na czterech ścieżkach satelity i w pionie</w:t>
+        <w:t xml:space="preserve">Stacja AME1, 2020–2024: EGMS (niebieska linia) i dobowe GNSS (pomarańczowe kropki) na czterech ścieżkach satelity i w pionie</w:t>
       </w:r>
     </w:p>
     <w:p>
@@ -1108,43 +915,53 @@
         <w:pStyle w:val="BodyText"/>
       </w:pPr>
       <w:r>
-        <w:t xml:space="preserve">Na wszystkich ścieżkach trend jest ten sam: ok. −20 do −30 mm w 5 lat. GNSS ma jednak duży ruch sezonowy (ok. ±10 mm w ciągu roku), którego EGMS prawie nie pokazuje. Dlatego tempo osiadania (K1) się zgadza, a rozrzut różnicy szeregów (K2, 4,7 mm) jest blisko progu. Przyczyny tej różnicy sezonowej nie badaliśmy. Pojedyncze skoki EGMS (np. ścieżka 15) to pojedyncze daty z odstającą wartością EGMS; nie zmieniają trendu.</w:t>
-      </w:r>
-    </w:p>
-    <w:p>
-      <w:pPr>
-        <w:pStyle w:val="BodyText"/>
-      </w:pPr>
-      <w:r>
-        <w:rPr>
-          <w:bCs/>
-          <w:b/>
-        </w:rPr>
-        <w:t xml:space="preserve">Ograniczenie:</w:t>
-      </w:r>
-      <w:r>
-        <w:t xml:space="preserve"> </w:t>
-      </w:r>
-      <w:r>
-        <w:t xml:space="preserve">EGMS jest kalibrowany modelem GNSS, więc to porównanie nie jest w pełni niezależne.</w:t>
+        <w:t xml:space="preserve">Na stacji AME1 trend na wszystkich ścieżkach jest ten sam (−20 do −30 mm w 5 lat). GNSS ma ruch sezonowy ok. ±10 mm, którego EGMS prawie nie pokazuje; stąd K2 blisko progu.</w:t>
       </w:r>
     </w:p>
     <w:bookmarkEnd w:id="29"/>
-    <w:bookmarkStart w:id="42" w:name="Xcf1241a5b0d5b5b7ff5886d23cd7ddc69895afe"/>
+    <w:bookmarkStart w:id="42" w:name="wynik-2-niwelacja-zachodnia-nrw"/>
     <w:p>
       <w:pPr>
         <w:pStyle w:val="Heading1"/>
       </w:pPr>
       <w:r>
-        <w:t xml:space="preserve">Wynik 2: niwelacja w NRW — niecki się zgadzają, poziom jest przesunięty</w:t>
-      </w:r>
-    </w:p>
-    <w:p>
-      <w:pPr>
-        <w:pStyle w:val="FirstParagraph"/>
-      </w:pPr>
-      <w:r>
-        <w:t xml:space="preserve">Zmiana wysokości z EGMS idzie prawie 1:1 ze zmianą z niwelacji (nachylenie 0,96), od 0 do −140 mm w 3 lata. Cała chmura punktów jest jednak lekko przesunięta w dół: EGMS pokazuje wszędzie trochę więcej osiadania.</w:t>
+        <w:t xml:space="preserve">Wynik 2: niwelacja — zachodnia NRW</w:t>
+      </w:r>
+    </w:p>
+    <w:p>
+      <w:pPr>
+        <w:numPr>
+          <w:ilvl w:val="0"/>
+          <w:numId w:val="1003"/>
+        </w:numPr>
+        <w:pStyle w:val="Compact"/>
+      </w:pPr>
+      <w:r>
+        <w:t xml:space="preserve">Zmiana wysokości z EGMS jest prawie 1:1 ze zmianą z niwelacji (nachylenie 0,96), od 0 do −140 mm w 3 lata.</w:t>
+      </w:r>
+    </w:p>
+    <w:p>
+      <w:pPr>
+        <w:numPr>
+          <w:ilvl w:val="0"/>
+          <w:numId w:val="1003"/>
+        </w:numPr>
+        <w:pStyle w:val="Compact"/>
+      </w:pPr>
+      <w:r>
+        <w:t xml:space="preserve">Cała chmura punktów jest przesunięta w dół: EGMS pokazuje więcej osiadania o −1,22 ± 0,05 mm/rok.</w:t>
+      </w:r>
+    </w:p>
+    <w:p>
+      <w:pPr>
+        <w:numPr>
+          <w:ilvl w:val="0"/>
+          <w:numId w:val="1003"/>
+        </w:numPr>
+        <w:pStyle w:val="Compact"/>
+      </w:pPr>
+      <w:r>
+        <w:t xml:space="preserve">Rozrzut różnic (1,04 mm/rok) jest taki sam jak u Even i in. (2024) w tym regionie (1,12 mm/rok).</w:t>
       </w:r>
     </w:p>
     <w:p>
@@ -1154,14 +971,14 @@
       <w:r>
         <w:drawing>
           <wp:inline>
-            <wp:extent cx="5334000" cy="4178926"/>
+            <wp:extent cx="5039999" cy="3948591"/>
             <wp:effectExtent b="0" l="0" r="0" t="0"/>
-            <wp:docPr descr="Mapa tempa ruchu pionowego EGMS 2019–2023: czerwone plamy to niecki osiadania, trójkąty to stacje GNSS, kółka to repery pokazane niżej" title="" id="31" name="Picture"/>
+            <wp:docPr descr="Mapa tempa ruchu pionowego EGMS 2019–2023" title="" id="31" name="Picture"/>
             <a:graphic>
               <a:graphicData uri="http://schemas.openxmlformats.org/drawingml/2006/picture">
                 <pic:pic>
                   <pic:nvPicPr>
-                    <pic:cNvPr descr="/tmp/claude-0/-home-user-2-geoworldlook-egmscheck/adccf45a-26f6-515f-aa00-03d5d0c40b81/scratchpad/docimg2/nrw_mapa_2019_2023.png" id="32" name="Picture"/>
+                    <pic:cNvPr descr="/tmp/claude-0/-home-user-2-geoworldlook-egmscheck/adccf45a-26f6-515f-aa00-03d5d0c40b81/scratchpad/userdoc/media/media/image3.png" id="32" name="Picture"/>
                     <pic:cNvPicPr>
                       <a:picLocks noChangeArrowheads="1" noChangeAspect="1"/>
                     </pic:cNvPicPr>
@@ -1175,7 +992,7 @@
                   <pic:spPr bwMode="auto">
                     <a:xfrm>
                       <a:off x="0" y="0"/>
-                      <a:ext cx="5334000" cy="4178926"/>
+                      <a:ext cx="5039999" cy="3948591"/>
                     </a:xfrm>
                     <a:prstGeom prst="rect">
                       <a:avLst/>
@@ -1199,7 +1016,7 @@
         <w:pStyle w:val="ImageCaption"/>
       </w:pPr>
       <w:r>
-        <w:t xml:space="preserve">Mapa tempa ruchu pionowego EGMS 2019–2023: czerwone plamy to niecki osiadania, trójkąty to stacje GNSS, kółka to repery pokazane niżej</w:t>
+        <w:t xml:space="preserve">Mapa tempa ruchu pionowego EGMS 2019–2023</w:t>
       </w:r>
     </w:p>
     <w:p>
@@ -1209,14 +1026,14 @@
       <w:r>
         <w:drawing>
           <wp:inline>
-            <wp:extent cx="4679999" cy="4930118"/>
+            <wp:extent cx="4319999" cy="4550878"/>
             <wp:effectExtent b="0" l="0" r="0" t="0"/>
-            <wp:docPr descr="Zmiana wysokości 2019–2022: niwelacja (oś pozioma) kontra EGMS (oś pionowa), 1216 reperów; pomarańczowe punkty to repery w nieckach" title="" id="34" name="Picture"/>
+            <wp:docPr descr="Zmiana wysokości 2019–2022: niwelacja kontra EGMS, 1216 reperów; pomarańczowe punkty = repery w nieckach" title="" id="34" name="Picture"/>
             <a:graphic>
               <a:graphicData uri="http://schemas.openxmlformats.org/drawingml/2006/picture">
                 <pic:pic>
                   <pic:nvPicPr>
-                    <pic:cNvPr descr="/tmp/claude-0/-home-user-2-geoworldlook-egmscheck/adccf45a-26f6-515f-aa00-03d5d0c40b81/scratchpad/docimg2/nrw_rozrzut_pasy.png" id="35" name="Picture"/>
+                    <pic:cNvPr descr="/tmp/claude-0/-home-user-2-geoworldlook-egmscheck/adccf45a-26f6-515f-aa00-03d5d0c40b81/scratchpad/userdoc/media/media/image4.png" id="35" name="Picture"/>
                     <pic:cNvPicPr>
                       <a:picLocks noChangeArrowheads="1" noChangeAspect="1"/>
                     </pic:cNvPicPr>
@@ -1230,7 +1047,7 @@
                   <pic:spPr bwMode="auto">
                     <a:xfrm>
                       <a:off x="0" y="0"/>
-                      <a:ext cx="4679999" cy="4930118"/>
+                      <a:ext cx="4319999" cy="4550878"/>
                     </a:xfrm>
                     <a:prstGeom prst="rect">
                       <a:avLst/>
@@ -1254,22 +1071,7 @@
         <w:pStyle w:val="ImageCaption"/>
       </w:pPr>
       <w:r>
-        <w:t xml:space="preserve">Zmiana wysokości 2019–2022: niwelacja (oś pozioma) kontra EGMS (oś pionowa), 1216 reperów; pomarańczowe punkty to repery w nieckach</w:t>
-      </w:r>
-    </w:p>
-    <w:p>
-      <w:pPr>
-        <w:pStyle w:val="BodyText"/>
-      </w:pPr>
-      <w:r>
-        <w:rPr>
-          <w:bCs/>
-          <w:b/>
-        </w:rPr>
-        <w:t xml:space="preserve">Kryteria ustalone przed obliczeniami</w:t>
-      </w:r>
-      <w:r>
-        <w:t xml:space="preserve">, w dwóch wariantach:</w:t>
+        <w:t xml:space="preserve">Zmiana wysokości 2019–2022: niwelacja kontra EGMS, 1216 reperów; pomarańczowe punkty = repery w nieckach</w:t>
       </w:r>
     </w:p>
     <w:tbl>
@@ -1338,7 +1140,7 @@
               <w:rPr>
                 <w:b/>
               </w:rPr>
-              <w:t xml:space="preserve">Wariant główny (wprost)</w:t>
+              <w:t xml:space="preserve">Wariant główny</w:t>
             </w:r>
           </w:p>
         </w:tc>
@@ -1417,7 +1219,7 @@
               <w:jc w:val="left"/>
             </w:pPr>
             <w:r>
-              <w:t xml:space="preserve">N2: zgodność kierunku ruchu (repery z ruchem ≥ 6 mm)</w:t>
+              <w:t xml:space="preserve">N2: zgodność kierunku ruchu</w:t>
             </w:r>
           </w:p>
         </w:tc>
@@ -1503,7 +1305,7 @@
               <w:jc w:val="left"/>
             </w:pPr>
             <w:r>
-              <w:t xml:space="preserve">nie dotyczy (grupa odniesienia)</w:t>
+              <w:t xml:space="preserve">nie dotyczy</w:t>
             </w:r>
           </w:p>
         </w:tc>
@@ -1559,45 +1361,7 @@
         </w:tc>
       </w:tr>
     </w:tbl>
-    <w:p>
-      <w:pPr>
-        <w:pStyle w:val="BodyText"/>
-      </w:pPr>
-      <w:r>
-        <w:t xml:space="preserve">Wariant główny nie spełnia progów przez stałe przesunięcie, a nie przez rozrzut. Rozrzut (1,04 mm/rok) jest taki sam jak u Even i in. (2024) w tym regionie (1,12 mm/rok). Przesunięcie EGMS względem 307 reperów stabilnych wynosi</w:t>
-      </w:r>
-      <w:r>
-        <w:t xml:space="preserve"> </w:t>
-      </w:r>
-      <w:r>
-        <w:rPr>
-          <w:bCs/>
-          <w:b/>
-        </w:rPr>
-        <w:t xml:space="preserve">−1,22 ± 0,05 mm/rok</w:t>
-      </w:r>
-      <w:r>
-        <w:t xml:space="preserve">.</w:t>
-      </w:r>
-    </w:p>
-    <w:p>
-      <w:pPr>
-        <w:pStyle w:val="BodyText"/>
-      </w:pPr>
-      <w:r>
-        <w:rPr>
-          <w:bCs/>
-          <w:b/>
-        </w:rPr>
-        <w:t xml:space="preserve">Niecki osiadania</w:t>
-      </w:r>
-      <w:r>
-        <w:t xml:space="preserve"> </w:t>
-      </w:r>
-      <w:r>
-        <w:t xml:space="preserve">(ruch według niwelacji co najmniej 10 mm/rok):</w:t>
-      </w:r>
-    </w:p>
+    <w:p/>
     <w:tbl>
       <w:tblPr>
         <w:tblStyle w:val="Table"/>
@@ -1799,7 +1563,7 @@
               <w:jc w:val="left"/>
             </w:pPr>
             <w:r>
-              <w:t xml:space="preserve">niecki</w:t>
+              <w:t xml:space="preserve">niecki (≥ 10 mm/rok)</w:t>
             </w:r>
           </w:p>
         </w:tc>
@@ -1823,7 +1587,7 @@
               <w:jc w:val="left"/>
             </w:pPr>
             <w:r>
-              <w:t xml:space="preserve">5,1 (po odjęciu przesunięcia 2,6)</w:t>
+              <w:t xml:space="preserve">5,1 (względnie 2,6)</w:t>
             </w:r>
           </w:p>
         </w:tc>
@@ -1944,35 +1708,7 @@
         <w:pStyle w:val="BodyText"/>
       </w:pPr>
       <w:r>
-        <w:rPr>
-          <w:bCs/>
-          <w:b/>
-        </w:rPr>
-        <w:t xml:space="preserve">Dlaczego to ważne:</w:t>
-      </w:r>
-      <w:r>
-        <w:t xml:space="preserve"> </w:t>
-      </w:r>
-      <w:r>
-        <w:t xml:space="preserve">niecki mają kilka kilometrów szerokości, a model GNSS używany do kalibracji EGMS ma siatkę ok. 50 km. Takich niecek kalibracja nie mogła „dorysować”, więc EGMS zmierzył je sam.</w:t>
-      </w:r>
-    </w:p>
-    <w:p>
-      <w:pPr>
-        <w:pStyle w:val="BodyText"/>
-      </w:pPr>
-      <w:r>
-        <w:rPr>
-          <w:bCs/>
-          <w:b/>
-        </w:rPr>
-        <w:t xml:space="preserve">Repery w czasie</w:t>
-      </w:r>
-      <w:r>
-        <w:t xml:space="preserve"> </w:t>
-      </w:r>
-      <w:r>
-        <w:t xml:space="preserve">(wybrane regułą, nie ręcznie): najszybsze osiadanie i mediana niecek. Niebieska linia to EGMS, żółte punkty to dwa pomiary niwelacyjne (przerywana linia tylko je łączy).</w:t>
+        <w:t xml:space="preserve">Niecki mają kilka kilometrów szerokości, a model GNSS do kalibracji EGMS ma siatkę ok. 50 km — niecki są mierzone przez EGMS, a nie odtwarzane z kalibracji.</w:t>
       </w:r>
     </w:p>
     <w:p>
@@ -1984,12 +1720,12 @@
           <wp:inline>
             <wp:extent cx="5334000" cy="2096786"/>
             <wp:effectExtent b="0" l="0" r="0" t="0"/>
-            <wp:docPr descr="Reper 5104900560, najszybsze osiadanie: niwelacja −140 mm, EGMS −143 mm" title="" id="37" name="Picture"/>
+            <wp:docPr descr="Reper 5104900560 (najszybsze osiadanie): niwelacja −140 mm, EGMS −143 mm" title="" id="37" name="Picture"/>
             <a:graphic>
               <a:graphicData uri="http://schemas.openxmlformats.org/drawingml/2006/picture">
                 <pic:pic>
                   <pic:nvPicPr>
-                    <pic:cNvPr descr="/tmp/claude-0/-home-user-2-geoworldlook-egmscheck/adccf45a-26f6-515f-aa00-03d5d0c40b81/scratchpad/docimg2/nrw_reper_5104900560.png" id="38" name="Picture"/>
+                    <pic:cNvPr descr="/tmp/claude-0/-home-user-2-geoworldlook-egmscheck/adccf45a-26f6-515f-aa00-03d5d0c40b81/scratchpad/userdoc/media/media/image5.png" id="38" name="Picture"/>
                     <pic:cNvPicPr>
                       <a:picLocks noChangeArrowheads="1" noChangeAspect="1"/>
                     </pic:cNvPicPr>
@@ -2027,7 +1763,7 @@
         <w:pStyle w:val="ImageCaption"/>
       </w:pPr>
       <w:r>
-        <w:t xml:space="preserve">Reper 5104900560, najszybsze osiadanie: niwelacja −140 mm, EGMS −143 mm</w:t>
+        <w:t xml:space="preserve">Reper 5104900560 (najszybsze osiadanie): niwelacja −140 mm, EGMS −143 mm</w:t>
       </w:r>
     </w:p>
     <w:p>
@@ -2039,12 +1775,12 @@
           <wp:inline>
             <wp:extent cx="5334000" cy="2096786"/>
             <wp:effectExtent b="0" l="0" r="0" t="0"/>
-            <wp:docPr descr="Reper 5104900593, mediana niecek: niwelacja −50 mm, EGMS −52 mm" title="" id="40" name="Picture"/>
+            <wp:docPr descr="Reper 5104900593 (mediana niecek): niwelacja −50 mm, EGMS −52 mm" title="" id="40" name="Picture"/>
             <a:graphic>
               <a:graphicData uri="http://schemas.openxmlformats.org/drawingml/2006/picture">
                 <pic:pic>
                   <pic:nvPicPr>
-                    <pic:cNvPr descr="/tmp/claude-0/-home-user-2-geoworldlook-egmscheck/adccf45a-26f6-515f-aa00-03d5d0c40b81/scratchpad/docimg2/nrw_reper_5104900593.png" id="41" name="Picture"/>
+                    <pic:cNvPr descr="/tmp/claude-0/-home-user-2-geoworldlook-egmscheck/adccf45a-26f6-515f-aa00-03d5d0c40b81/scratchpad/userdoc/media/media/image6.png" id="41" name="Picture"/>
                     <pic:cNvPicPr>
                       <a:picLocks noChangeArrowheads="1" noChangeAspect="1"/>
                     </pic:cNvPicPr>
@@ -2082,25 +1818,17 @@
         <w:pStyle w:val="ImageCaption"/>
       </w:pPr>
       <w:r>
-        <w:t xml:space="preserve">Reper 5104900593, mediana niecek: niwelacja −50 mm, EGMS −52 mm</w:t>
+        <w:t xml:space="preserve">Reper 5104900593 (mediana niecek): niwelacja −50 mm, EGMS −52 mm</w:t>
       </w:r>
     </w:p>
     <w:bookmarkEnd w:id="42"/>
-    <w:bookmarkStart w:id="46" w:name="Xd7e264cb1d269517b23178f31217f2f9ed96b37"/>
+    <w:bookmarkStart w:id="46" w:name="reper-stabilny-4804901107"/>
     <w:p>
       <w:pPr>
         <w:pStyle w:val="Heading1"/>
       </w:pPr>
       <w:r>
-        <w:t xml:space="preserve">Reper stabilny: dlaczego −3 mm to nie powód do niepokoju</w:t>
-      </w:r>
-    </w:p>
-    <w:p>
-      <w:pPr>
-        <w:pStyle w:val="FirstParagraph"/>
-      </w:pPr>
-      <w:r>
-        <w:t xml:space="preserve">Na reperze 4804901107 niwelacja nie pokazuje ruchu, a EGMS pokazuje −3,1 mm w 3,16 roku. Ten rozjazd wynika ze wspólnego przesunięcia EGMS, a nie z ruchu reperu.</w:t>
+        <w:t xml:space="preserve">Reper stabilny 4804901107</w:t>
       </w:r>
     </w:p>
     <w:tbl>
@@ -2131,14 +1859,7 @@
           <w:p>
             <w:pPr>
               <w:pStyle w:val="Compact"/>
-              <w:jc w:val="left"/>
-            </w:pPr>
-            <w:r>
-              <w:rPr>
-                <w:b/>
-              </w:rPr>
-              <w:t xml:space="preserve">Co</w:t>
-            </w:r>
+            </w:pPr>
           </w:p>
         </w:tc>
         <w:tc>
@@ -2166,7 +1887,7 @@
               <w:jc w:val="left"/>
             </w:pPr>
             <w:r>
-              <w:t xml:space="preserve">Niwelacja / EGMS</w:t>
+              <w:t xml:space="preserve">Niwelacja / EGMS (3,16 roku)</w:t>
             </w:r>
           </w:p>
         </w:tc>
@@ -2192,19 +1913,19 @@
               <w:jc w:val="left"/>
             </w:pPr>
             <w:r>
-              <w:t xml:space="preserve">Wspólne tempo EGMS na wszystkich 307 reperach stabilnych</w:t>
-            </w:r>
-          </w:p>
-        </w:tc>
-        <w:tc>
-          <w:tcPr/>
-          <w:p>
-            <w:pPr>
-              <w:pStyle w:val="Compact"/>
-              <w:jc w:val="left"/>
-            </w:pPr>
-            <w:r>
-              <w:t xml:space="preserve">−1,22 mm/rok, czyli −3,8 mm w tym czasie</w:t>
+              <w:t xml:space="preserve">Wspólne tempo EGMS na 307 reperach stabilnych</w:t>
+            </w:r>
+          </w:p>
+        </w:tc>
+        <w:tc>
+          <w:tcPr/>
+          <w:p>
+            <w:pPr>
+              <w:pStyle w:val="Compact"/>
+              <w:jc w:val="left"/>
+            </w:pPr>
+            <w:r>
+              <w:t xml:space="preserve">−1,22 mm/rok = −3,8 mm w tym czasie</w:t>
             </w:r>
           </w:p>
         </w:tc>
@@ -2218,19 +1939,19 @@
               <w:jc w:val="left"/>
             </w:pPr>
             <w:r>
-              <w:t xml:space="preserve">Położenie tego reperu w grupie stabilnej</w:t>
-            </w:r>
-          </w:p>
-        </w:tc>
-        <w:tc>
-          <w:tcPr/>
-          <w:p>
-            <w:pPr>
-              <w:pStyle w:val="Compact"/>
-              <w:jc w:val="left"/>
-            </w:pPr>
-            <w:r>
-              <w:t xml:space="preserve">środek rozkładu (mediana grupy −3,7 mm)</w:t>
+              <w:t xml:space="preserve">Mediana zmiany EGMS w grupie stabilnej</w:t>
+            </w:r>
+          </w:p>
+        </w:tc>
+        <w:tc>
+          <w:tcPr/>
+          <w:p>
+            <w:pPr>
+              <w:pStyle w:val="Compact"/>
+              <w:jc w:val="left"/>
+            </w:pPr>
+            <w:r>
+              <w:t xml:space="preserve">−3,7 mm</w:t>
             </w:r>
           </w:p>
         </w:tc>
@@ -2256,7 +1977,7 @@
               <w:jc w:val="left"/>
             </w:pPr>
             <w:r>
-              <w:t xml:space="preserve">+0,8 mm: mieści się w szumie EGMS (±1,1 mm) i w typowej różnicy z niwelacją (±4,6 mm)</w:t>
+              <w:t xml:space="preserve">+0,8 mm (szum EGMS ±1,1 mm, typowa różnica ±4,6 mm)</w:t>
             </w:r>
           </w:p>
         </w:tc>
@@ -2271,12 +1992,12 @@
           <wp:inline>
             <wp:extent cx="5334000" cy="2880741"/>
             <wp:effectExtent b="0" l="0" r="0" t="0"/>
-            <wp:docPr descr="Reper 4804901107: A — EGMS z linią wspólnego tempa grupy stabilnej, B — po odjęciu tego tempa, C — rozkład zmian EGMS na 307 reperach stabilnych z progiem N3" title="" id="44" name="Picture"/>
+            <wp:docPr descr="Reper 4804901107: A — EGMS i wspólne tempo grupy stabilnej, B — po odjęciu tego tempa, C — rozkład zmian EGMS na 307 reperach stabilnych z progiem N3" title="" id="44" name="Picture"/>
             <a:graphic>
               <a:graphicData uri="http://schemas.openxmlformats.org/drawingml/2006/picture">
                 <pic:pic>
                   <pic:nvPicPr>
-                    <pic:cNvPr descr="/tmp/claude-0/-home-user-2-geoworldlook-egmscheck/adccf45a-26f6-515f-aa00-03d5d0c40b81/scratchpad/docimg2/nrw_reper_stabilny_4804901107.png" id="45" name="Picture"/>
+                    <pic:cNvPr descr="/tmp/claude-0/-home-user-2-geoworldlook-egmscheck/adccf45a-26f6-515f-aa00-03d5d0c40b81/scratchpad/userdoc/media/media/image7.png" id="45" name="Picture"/>
                     <pic:cNvPicPr>
                       <a:picLocks noChangeArrowheads="1" noChangeAspect="1"/>
                     </pic:cNvPicPr>
@@ -2314,7 +2035,7 @@
         <w:pStyle w:val="ImageCaption"/>
       </w:pPr>
       <w:r>
-        <w:t xml:space="preserve">Reper 4804901107: A — EGMS z linią wspólnego tempa grupy stabilnej, B — po odjęciu tego tempa, C — rozkład zmian EGMS na 307 reperach stabilnych z progiem N3</w:t>
+        <w:t xml:space="preserve">Reper 4804901107: A — EGMS i wspólne tempo grupy stabilnej, B — po odjęciu tego tempa, C — rozkład zmian EGMS na 307 reperach stabilnych z progiem N3</w:t>
       </w:r>
     </w:p>
     <w:p>
@@ -2322,121 +2043,17 @@
         <w:pStyle w:val="BodyText"/>
       </w:pPr>
       <w:r>
-        <w:t xml:space="preserve">Jak czytać: w panelu A porównujemy EGMS z kropkowaną linią wspólnego tempa w dniu drugiego pomiaru. W panelu B to samo po odjęciu wspólnego tempa: niwelacja leży w pasach niepewności. W panelu C widać, że ten reper jest typowy dla całej grupy, a kryterium N3 (mediana do 5 mm) jest spełnione. Po drugim pomiarze niwelacyjnym nie mamy pomiaru naziemnego, więc tamten odcinek niczego nie rozstrzyga.</w:t>
-      </w:r>
-    </w:p>
-    <w:p>
-      <w:pPr>
-        <w:pStyle w:val="BodyText"/>
-      </w:pPr>
-      <w:r>
-        <w:rPr>
-          <w:bCs/>
-          <w:b/>
-        </w:rPr>
-        <w:t xml:space="preserve">Analogia:</w:t>
-      </w:r>
-      <w:r>
-        <w:t xml:space="preserve"> </w:t>
-      </w:r>
-      <w:r>
-        <w:t xml:space="preserve">mierzymy wzrost ludzi na promie. Miarka od pokładu pokazuje, że nikt się nie zmienia. GPS liczony od poziomu morza pokazuje, że wszyscy obniżają się o 1 mm na rok, bo cały prom powoli osiada. Obie miary są dobre, tylko mają inne „zero”. Niwelacja liczy od reperów nawiązania sieci, a EGMS od układu ETRF2000 przez GNSS.</w:t>
-      </w:r>
-    </w:p>
-    <w:p>
-      <w:pPr>
-        <w:pStyle w:val="BodyText"/>
-      </w:pPr>
-      <w:r>
-        <w:rPr>
-          <w:bCs/>
-          <w:b/>
-        </w:rPr>
-        <w:t xml:space="preserve">Co jest pewne, a co jest hipotezą:</w:t>
-      </w:r>
-      <w:r>
-        <w:t xml:space="preserve"> </w:t>
-      </w:r>
-      <w:r>
-        <w:t xml:space="preserve">że przesunięcie jest wspólne dla wszystkich reperów stabilnych i mieści się w progu, to zmierzyliśmy. Że jego przyczyną jest różne „zero” układów odniesienia, to najbardziej prawdopodobne wyjaśnienie, ale go nie sprawdzaliśmy. Even i in. (2024) też go nie podają.</w:t>
+        <w:t xml:space="preserve">Różnica na tym reperze odpowiada wspólnemu przesunięciu całej grupy stabilnej; po jego odjęciu mieści się w niepewności. Kryterium N3 jest spełnione.</w:t>
       </w:r>
     </w:p>
     <w:bookmarkEnd w:id="46"/>
-    <w:bookmarkStart w:id="47" w:name="Xfc3cf903a6ee5ebb8b3ca9e6e6a8aa8578f0c56"/>
+    <w:bookmarkStart w:id="47" w:name="niepewność"/>
     <w:p>
       <w:pPr>
         <w:pStyle w:val="Heading1"/>
       </w:pPr>
       <w:r>
-        <w:t xml:space="preserve">Niepewność: co deklaruje EGMS, a jaka jest faktyczna różnica</w:t>
-      </w:r>
-    </w:p>
-    <w:p>
-      <w:pPr>
-        <w:pStyle w:val="FirstParagraph"/>
-      </w:pPr>
-      <w:r>
-        <w:t xml:space="preserve">EGMS deklaruje szum ok. 2 razy mniejszy, niż wynosi faktyczna różnica z niwelacją. Na wykresie rozrzutu i na rycinach reperów są dwa pasy (±2σ):</w:t>
-      </w:r>
-    </w:p>
-    <w:p>
-      <w:pPr>
-        <w:numPr>
-          <w:ilvl w:val="0"/>
-          <w:numId w:val="1002"/>
-        </w:numPr>
-        <w:pStyle w:val="Compact"/>
-      </w:pPr>
-      <w:r>
-        <w:rPr>
-          <w:bCs/>
-          <w:b/>
-        </w:rPr>
-        <w:t xml:space="preserve">wąski: szum EGMS.</w:t>
-      </w:r>
-      <w:r>
-        <w:t xml:space="preserve"> </w:t>
-      </w:r>
-      <w:r>
-        <w:t xml:space="preserve">Bierzemy go z kolumny</w:t>
-      </w:r>
-      <w:r>
-        <w:t xml:space="preserve"> </w:t>
-      </w:r>
-      <w:r>
-        <w:rPr>
-          <w:iCs/>
-          <w:i/>
-        </w:rPr>
-        <w:t xml:space="preserve">rmse</w:t>
-      </w:r>
-      <w:r>
-        <w:t xml:space="preserve"> </w:t>
-      </w:r>
-      <w:r>
-        <w:t xml:space="preserve">w plikach EGMS. Zmiana wysokości to różnica dwóch odczytów, więc σ = √2 · rmse.</w:t>
-      </w:r>
-    </w:p>
-    <w:p>
-      <w:pPr>
-        <w:numPr>
-          <w:ilvl w:val="0"/>
-          <w:numId w:val="1002"/>
-        </w:numPr>
-        <w:pStyle w:val="Compact"/>
-      </w:pPr>
-      <w:r>
-        <w:rPr>
-          <w:bCs/>
-          <w:b/>
-        </w:rPr>
-        <w:t xml:space="preserve">szeroki: typowa różnica EGMS–niwelacja.</w:t>
-      </w:r>
-      <w:r>
-        <w:t xml:space="preserve"> </w:t>
-      </w:r>
-      <w:r>
-        <w:t xml:space="preserve">To rozrzut na reperach, które według niwelacji się nie ruszają (0,73 mm/rok), razy czas między pomiarami. Obejmuje szum EGMS, błąd niwelacji, różnicę między punktem a komórką 100 m i lokalne błędy EGMS.</w:t>
+        <w:t xml:space="preserve">Niepewność</w:t>
       </w:r>
     </w:p>
     <w:tbl>
@@ -2505,7 +2122,7 @@
               <w:rPr>
                 <w:b/>
               </w:rPr>
-              <w:t xml:space="preserve">Repery w pasie: wariant główny</w:t>
+              <w:t xml:space="preserve">W pasie: wariant główny</w:t>
             </w:r>
           </w:p>
         </w:tc>
@@ -2520,7 +2137,7 @@
               <w:rPr>
                 <w:b/>
               </w:rPr>
-              <w:t xml:space="preserve">Repery w pasie: po odjęciu przesunięcia</w:t>
+              <w:t xml:space="preserve">W pasie: wariant względny</w:t>
             </w:r>
           </w:p>
         </w:tc>
@@ -2534,7 +2151,7 @@
               <w:jc w:val="left"/>
             </w:pPr>
             <w:r>
-              <w:t xml:space="preserve">szum EGMS (z rmse)</w:t>
+              <w:t xml:space="preserve">szum EGMS (σ = √2 · rmse z plików EGMS)</w:t>
             </w:r>
           </w:p>
         </w:tc>
@@ -2584,7 +2201,7 @@
               <w:jc w:val="left"/>
             </w:pPr>
             <w:r>
-              <w:t xml:space="preserve">typowa różnica (repery stabilne)</w:t>
+              <w:t xml:space="preserve">typowa różnica EGMS–niwelacja (repery stabilne)</w:t>
             </w:r>
           </w:p>
         </w:tc>
@@ -2626,32 +2243,7 @@
         </w:tc>
       </w:tr>
     </w:tbl>
-    <w:p>
-      <w:pPr>
-        <w:pStyle w:val="BodyText"/>
-      </w:pPr>
-      <w:r>
-        <w:t xml:space="preserve">W szerokim pasie po odjęciu przesunięcia mieści się 67% reperów, a nie ok. 95%. Repery stabilne nie opisują więc wszystkich. W nieckach różnice rosną z wielkością ruchu: −14 mm przy −73 mm i −13 mm przy −128 mm. Tego związku jeszcze nie policzyliśmy osobno.</w:t>
-      </w:r>
-    </w:p>
-    <w:p>
-      <w:pPr>
-        <w:pStyle w:val="BodyText"/>
-      </w:pPr>
-      <w:r>
-        <w:rPr>
-          <w:bCs/>
-          <w:b/>
-        </w:rPr>
-        <w:t xml:space="preserve">Największe różnice w nieckach</w:t>
-      </w:r>
-      <w:r>
-        <w:t xml:space="preserve"> </w:t>
-      </w:r>
-      <w:r>
-        <w:t xml:space="preserve">(pokazujemy też to, co nie pasuje):</w:t>
-      </w:r>
-    </w:p>
+    <w:p/>
     <w:tbl>
       <w:tblPr>
         <w:tblStyle w:val="Table"/>
@@ -2668,12 +2260,11 @@
         </w:tblBorders>
       </w:tblPr>
       <w:tblGrid>
-        <w:gridCol w:w="1320"/>
-        <w:gridCol w:w="1320"/>
-        <w:gridCol w:w="1320"/>
-        <w:gridCol w:w="1320"/>
-        <w:gridCol w:w="1320"/>
-        <w:gridCol w:w="1320"/>
+        <w:gridCol w:w="1584"/>
+        <w:gridCol w:w="1584"/>
+        <w:gridCol w:w="1584"/>
+        <w:gridCol w:w="1584"/>
+        <w:gridCol w:w="1584"/>
       </w:tblGrid>
       <w:tr>
         <w:trPr>
@@ -2690,7 +2281,7 @@
               <w:rPr>
                 <w:b/>
               </w:rPr>
-              <w:t xml:space="preserve">Reper</w:t>
+              <w:t xml:space="preserve">Reper (największe różnice w nieckach)</w:t>
             </w:r>
           </w:p>
         </w:tc>
@@ -2754,21 +2345,6 @@
             </w:r>
           </w:p>
         </w:tc>
-        <w:tc>
-          <w:tcPr/>
-          <w:p>
-            <w:pPr>
-              <w:pStyle w:val="Compact"/>
-              <w:jc w:val="left"/>
-            </w:pPr>
-            <w:r>
-              <w:rPr>
-                <w:b/>
-              </w:rPr>
-              <w:t xml:space="preserve">Co to znaczy</w:t>
-            </w:r>
-          </w:p>
-        </w:tc>
       </w:tr>
       <w:tr>
         <w:tc>
@@ -2831,18 +2407,6 @@
             </w:r>
           </w:p>
         </w:tc>
-        <w:tc>
-          <w:tcPr/>
-          <w:p>
-            <w:pPr>
-              <w:pStyle w:val="Compact"/>
-              <w:jc w:val="left"/>
-            </w:pPr>
-            <w:r>
-              <w:t xml:space="preserve">EGMS: mniej osiadania</w:t>
-            </w:r>
-          </w:p>
-        </w:tc>
       </w:tr>
       <w:tr>
         <w:tc>
@@ -2905,18 +2469,6 @@
             </w:r>
           </w:p>
         </w:tc>
-        <w:tc>
-          <w:tcPr/>
-          <w:p>
-            <w:pPr>
-              <w:pStyle w:val="Compact"/>
-              <w:jc w:val="left"/>
-            </w:pPr>
-            <w:r>
-              <w:t xml:space="preserve">EGMS: więcej osiadania</w:t>
-            </w:r>
-          </w:p>
-        </w:tc>
       </w:tr>
       <w:tr>
         <w:tc>
@@ -2979,28 +2531,8 @@
             </w:r>
           </w:p>
         </w:tc>
-        <w:tc>
-          <w:tcPr/>
-          <w:p>
-            <w:pPr>
-              <w:pStyle w:val="Compact"/>
-              <w:jc w:val="left"/>
-            </w:pPr>
-            <w:r>
-              <w:t xml:space="preserve">EGMS: więcej osiadania</w:t>
-            </w:r>
-          </w:p>
-        </w:tc>
       </w:tr>
     </w:tbl>
-    <w:p>
-      <w:pPr>
-        <w:pStyle w:val="BodyText"/>
-      </w:pPr>
-      <w:r>
-        <w:t xml:space="preserve">Reper 5104900368 odstaje naprawdę. Sam EGMS oznacza tę komórkę jako zaszumioną: szum jest ok. 4 razy większy niż zwykle. Możliwa przyczyna to brzeg niecki, gdzie komórka 100 × 100 m uśrednia teren osiadający szybciej i wolniej; tego nie sprawdzaliśmy.</w:t>
-      </w:r>
-    </w:p>
     <w:bookmarkEnd w:id="47"/>
     <w:bookmarkStart w:id="48" w:name="wnioski"/>
     <w:p>
@@ -3009,156 +2541,6 @@
       </w:pPr>
       <w:r>
         <w:t xml:space="preserve">Wnioski</w:t>
-      </w:r>
-    </w:p>
-    <w:p>
-      <w:pPr>
-        <w:numPr>
-          <w:ilvl w:val="0"/>
-          <w:numId w:val="1003"/>
-        </w:numPr>
-        <w:pStyle w:val="Compact"/>
-      </w:pPr>
-      <w:r>
-        <w:rPr>
-          <w:bCs/>
-          <w:b/>
-        </w:rPr>
-        <w:t xml:space="preserve">Pomiar naziemny potwierdza osiadanie widoczne w EGMS.</w:t>
-      </w:r>
-      <w:r>
-        <w:t xml:space="preserve"> </w:t>
-      </w:r>
-      <w:r>
-        <w:t xml:space="preserve">Niwelacja, niezależna od GNSS, pokazuje te same niecki: to samo miejsce, ten sam kierunek ruchu (100% reperów w nieckach) i prawie tę samą skalę (nachylenie 0,98, do −140 mm w 3 lata).</w:t>
-      </w:r>
-    </w:p>
-    <w:p>
-      <w:pPr>
-        <w:numPr>
-          <w:ilvl w:val="0"/>
-          <w:numId w:val="1003"/>
-        </w:numPr>
-        <w:pStyle w:val="Compact"/>
-      </w:pPr>
-      <w:r>
-        <w:rPr>
-          <w:bCs/>
-          <w:b/>
-        </w:rPr>
-        <w:t xml:space="preserve">EGMS mierzy ruch sam, a nie tylko powtarza kalibrację GNSS.</w:t>
-      </w:r>
-      <w:r>
-        <w:t xml:space="preserve"> </w:t>
-      </w:r>
-      <w:r>
-        <w:t xml:space="preserve">Niecki są kilkakrotnie mniejsze niż siatka modelu kalibracji.</w:t>
-      </w:r>
-    </w:p>
-    <w:p>
-      <w:pPr>
-        <w:numPr>
-          <w:ilvl w:val="0"/>
-          <w:numId w:val="1003"/>
-        </w:numPr>
-        <w:pStyle w:val="Compact"/>
-      </w:pPr>
-      <w:r>
-        <w:rPr>
-          <w:bCs/>
-          <w:b/>
-        </w:rPr>
-        <w:t xml:space="preserve">Poziom bezwzględny wymaga ostrożności.</w:t>
-      </w:r>
-      <w:r>
-        <w:t xml:space="preserve"> </w:t>
-      </w:r>
-      <w:r>
-        <w:t xml:space="preserve">EGMS ma wspólne przesunięcie ok. −1,2 mm/rok względem niwelacji. Po jego odjęciu wszystkie liczone kryteria są spełnione, a połowa reperów zgadza się w 3,4 mm (w 3 lata).</w:t>
-      </w:r>
-    </w:p>
-    <w:p>
-      <w:pPr>
-        <w:numPr>
-          <w:ilvl w:val="0"/>
-          <w:numId w:val="1003"/>
-        </w:numPr>
-        <w:pStyle w:val="Compact"/>
-      </w:pPr>
-      <w:r>
-        <w:rPr>
-          <w:bCs/>
-          <w:b/>
-        </w:rPr>
-        <w:t xml:space="preserve">Deklarowany szum EGMS jest zbyt optymistyczny.</w:t>
-      </w:r>
-      <w:r>
-        <w:t xml:space="preserve"> </w:t>
-      </w:r>
-      <w:r>
-        <w:t xml:space="preserve">Faktyczna różnica z niwelacją jest ok. 2 razy większa, a w nieckach rośnie z wielkością ruchu.</w:t>
-      </w:r>
-    </w:p>
-    <w:p>
-      <w:pPr>
-        <w:numPr>
-          <w:ilvl w:val="0"/>
-          <w:numId w:val="1003"/>
-        </w:numPr>
-        <w:pStyle w:val="Compact"/>
-      </w:pPr>
-      <w:r>
-        <w:rPr>
-          <w:bCs/>
-          <w:b/>
-        </w:rPr>
-        <w:t xml:space="preserve">Wynik zgadza się z literaturą.</w:t>
-      </w:r>
-      <w:r>
-        <w:t xml:space="preserve"> </w:t>
-      </w:r>
-      <w:r>
-        <w:t xml:space="preserve">Rozrzut jest taki sam jak u Even i in. (2024) dla tego regionu.</w:t>
-      </w:r>
-    </w:p>
-    <w:p>
-      <w:pPr>
-        <w:pStyle w:val="FirstParagraph"/>
-      </w:pPr>
-      <w:r>
-        <w:rPr>
-          <w:bCs/>
-          <w:b/>
-        </w:rPr>
-        <w:t xml:space="preserve">Praktycznie:</w:t>
-      </w:r>
-      <w:r>
-        <w:t xml:space="preserve"> </w:t>
-      </w:r>
-      <w:r>
-        <w:t xml:space="preserve">EGMS dobrze pokazuje, gdzie i o ile teren osiada, przy ruchu od kilku mm/rok w górę. Przy ruchu poniżej ok. 2 mm/rok i przy wysokościach bezwzględnych potrzebny jest punkt odniesienia z ziemi. EGMS jest produktem archiwalnym, aktualizowanym raz w roku, i nie służy do wykrywania zdarzeń nagłych.</w:t>
-      </w:r>
-    </w:p>
-    <w:bookmarkEnd w:id="48"/>
-    <w:bookmarkStart w:id="49" w:name="ograniczenia-i-co-planujemy"/>
-    <w:p>
-      <w:pPr>
-        <w:pStyle w:val="Heading1"/>
-      </w:pPr>
-      <w:r>
-        <w:t xml:space="preserve">Ograniczenia i co planujemy</w:t>
-      </w:r>
-    </w:p>
-    <w:p>
-      <w:pPr>
-        <w:pStyle w:val="FirstParagraph"/>
-      </w:pPr>
-      <w:r>
-        <w:rPr>
-          <w:bCs/>
-          <w:b/>
-        </w:rPr>
-        <w:t xml:space="preserve">Ograniczenia:</w:t>
       </w:r>
     </w:p>
     <w:p>
@@ -3170,7 +2552,7 @@
         <w:pStyle w:val="Compact"/>
       </w:pPr>
       <w:r>
-        <w:t xml:space="preserve">niwelacja ma dwa pomiary, więc porównujemy zmianę między dwoma dniami, a nie przebieg w czasie;</w:t>
+        <w:t xml:space="preserve">Niwelacja, niezależna od GNSS, potwierdza osiadanie widoczne w EGMS: to samo miejsce, ten sam kierunek ruchu (100% reperów w nieckach) i ta sama skala (nachylenie 0,98).</w:t>
       </w:r>
     </w:p>
     <w:p>
@@ -3182,7 +2564,7 @@
         <w:pStyle w:val="Compact"/>
       </w:pPr>
       <w:r>
-        <w:t xml:space="preserve">EGMS L3 to komórki 100 m z datami przepróbkowanymi co 6 dni, a produkt zakłada ruch pionowy;</w:t>
+        <w:t xml:space="preserve">EGMS mierzy niecki samodzielnie — są kilkakrotnie mniejsze niż siatka modelu kalibracji GNSS.</w:t>
       </w:r>
     </w:p>
     <w:p>
@@ -3194,7 +2576,7 @@
         <w:pStyle w:val="Compact"/>
       </w:pPr>
       <w:r>
-        <w:t xml:space="preserve">przesunięcie EGMS nie jest jednakowe w całym obszarze, więc odjęcie jednej stałej to uproszczenie;</w:t>
+        <w:t xml:space="preserve">EGMS ma wspólne przesunięcie −1,22 mm/rok względem niwelacji. Po jego odjęciu wszystkie liczone kryteria są spełnione; połowa reperów zgadza się w 3,4 mm (3 lata).</w:t>
       </w:r>
     </w:p>
     <w:p>
@@ -3206,7 +2588,41 @@
         <w:pStyle w:val="Compact"/>
       </w:pPr>
       <w:r>
-        <w:t xml:space="preserve">GNSS w NRW nie rozstrzyga niczego, bo w obszarze nie ma osiadającej stacji.</w:t>
+        <w:t xml:space="preserve">Szum deklarowany w plikach EGMS jest ok. 2 razy mniejszy niż faktyczna różnica z niwelacją.</w:t>
+      </w:r>
+    </w:p>
+    <w:p>
+      <w:pPr>
+        <w:numPr>
+          <w:ilvl w:val="0"/>
+          <w:numId w:val="1004"/>
+        </w:numPr>
+        <w:pStyle w:val="Compact"/>
+      </w:pPr>
+      <w:r>
+        <w:t xml:space="preserve">W Groningen tempo osiadania z EGMS zgadza się z GNSS w 99% par; wynik formalny: zgodność częściowa.</w:t>
+      </w:r>
+    </w:p>
+    <w:p>
+      <w:pPr>
+        <w:numPr>
+          <w:ilvl w:val="0"/>
+          <w:numId w:val="1004"/>
+        </w:numPr>
+        <w:pStyle w:val="Compact"/>
+      </w:pPr>
+      <w:r>
+        <w:t xml:space="preserve">EGMS nadaje się do oceny, gdzie i o ile teren osiada (ruch od kilku mm/rok). Przy ruchu poniżej ok. 2 mm/rok i wysokościach bezwzględnych potrzebny jest punkt odniesienia z pomiaru naziemnego.</w:t>
+      </w:r>
+    </w:p>
+    <w:bookmarkEnd w:id="48"/>
+    <w:bookmarkStart w:id="50" w:name="egms-w-praktyce-deutsche-bahn"/>
+    <w:p>
+      <w:pPr>
+        <w:pStyle w:val="Heading1"/>
+      </w:pPr>
+      <w:r>
+        <w:t xml:space="preserve">EGMS w praktyce: Deutsche Bahn</w:t>
       </w:r>
     </w:p>
     <w:p>
@@ -3214,11 +2630,18 @@
         <w:pStyle w:val="FirstParagraph"/>
       </w:pPr>
       <w:r>
-        <w:rPr>
-          <w:bCs/>
-          <w:b/>
-        </w:rPr>
-        <w:t xml:space="preserve">Co planujemy:</w:t>
+        <w:t xml:space="preserve">DB InfraGO (Deutsche Bahn, sieć 33 400 km) testuje EGMS jako warstwę wczesnego ostrzegania o nierównym osiadaniu toru w miejscach słabego odwodnienia (</w:t>
+      </w:r>
+      <w:hyperlink r:id="rId49">
+        <w:r>
+          <w:rPr>
+            <w:rStyle w:val="Hyperlink"/>
+          </w:rPr>
+          <w:t xml:space="preserve">Copernicus Land Monitoring Service</w:t>
+        </w:r>
+      </w:hyperlink>
+      <w:r>
+        <w:t xml:space="preserve">):</w:t>
       </w:r>
     </w:p>
     <w:p>
@@ -3230,7 +2653,7 @@
         <w:pStyle w:val="Compact"/>
       </w:pPr>
       <w:r>
-        <w:t xml:space="preserve">Policzyć, jak różnica EGMS − niwelacja rośnie z wielkością ruchu, i sprawdzić, czy największe różnice leżą na brzegach niecek.</w:t>
+        <w:t xml:space="preserve">pilotaż na południe od Monachium: punkty EGMS w pasie 30 m wzdłuż toru, ranking odcinków do utrzymania;</w:t>
       </w:r>
     </w:p>
     <w:p>
@@ -3242,7 +2665,7 @@
         <w:pStyle w:val="Compact"/>
       </w:pPr>
       <w:r>
-        <w:t xml:space="preserve">Sprawdzić na mapie, które odkrywki leżą w nieckach, i wyjaśnić źródło przesunięcia.</w:t>
+        <w:t xml:space="preserve">wilgotność gleby w warstwie 60–100 cm wyraźnie wiąże się z ruchem terenu (warstwa 0–30 cm — słabo);</w:t>
       </w:r>
     </w:p>
     <w:p>
@@ -3254,48 +2677,37 @@
         <w:pStyle w:val="Compact"/>
       </w:pPr>
       <w:r>
-        <w:t xml:space="preserve">Pokazać monitoring częstszy niż raz w roku: własne przetworzenie Sentinel-1 (ASF HyP3 i MintPy) co 12 dni dla 2024–2026, najpierw sprawdzone na okresie, który pokrywa EGMS.</w:t>
-      </w:r>
-    </w:p>
-    <w:bookmarkEnd w:id="49"/>
-    <w:bookmarkStart w:id="51" w:name="egms-w-praktyce-deutsche-bahn"/>
+        <w:t xml:space="preserve">EGMS pokazał ruchy do 10 mm w ciągu dni–tygodni po silnych opadach;</w:t>
+      </w:r>
+    </w:p>
+    <w:p>
+      <w:pPr>
+        <w:numPr>
+          <w:ilvl w:val="0"/>
+          <w:numId w:val="1005"/>
+        </w:numPr>
+        <w:pStyle w:val="Compact"/>
+      </w:pPr>
+      <w:r>
+        <w:t xml:space="preserve">DB wskazuje potrzebę walidacji pomiarem naziemnym przed rutynowym użyciem.</w:t>
+      </w:r>
+    </w:p>
+    <w:p>
+      <w:pPr>
+        <w:pStyle w:val="FirstParagraph"/>
+      </w:pPr>
+      <w:r>
+        <w:t xml:space="preserve">Związek z wynikami: DB porównuje sąsiednie odcinki, więc wspólne przesunięcie EGMS nie ma znaczenia; walidacja naziemna, której DB potrzebuje, jest przedmiotem tego raportu.</w:t>
+      </w:r>
+    </w:p>
+    <w:bookmarkEnd w:id="50"/>
+    <w:bookmarkStart w:id="55" w:name="źródła-danych"/>
     <w:p>
       <w:pPr>
         <w:pStyle w:val="Heading1"/>
       </w:pPr>
       <w:r>
-        <w:t xml:space="preserve">EGMS w praktyce: Deutsche Bahn</w:t>
-      </w:r>
-    </w:p>
-    <w:p>
-      <w:pPr>
-        <w:pStyle w:val="FirstParagraph"/>
-      </w:pPr>
-      <w:r>
-        <w:t xml:space="preserve">DB InfraGO, spółka Deutsche Bahn odpowiedzialna za utrzymanie sieci (33 400 km torów), testuje EGMS jako warstwę wczesnego ostrzegania o niestabilności toru (</w:t>
-      </w:r>
-      <w:hyperlink r:id="rId50">
-        <w:r>
-          <w:rPr>
-            <w:rStyle w:val="Hyperlink"/>
-          </w:rPr>
-          <w:t xml:space="preserve">opis przypadku, Copernicus Land Monitoring Service</w:t>
-        </w:r>
-      </w:hyperlink>
-      <w:r>
-        <w:t xml:space="preserve">). Chodzi o „błotne miejsca”: muł wyciskany w podsypkę przy złym odwodnieniu, przez który tor osiada nierówno. Nie widać ich na zdjęciach optycznych, bo woda gromadzi się ok. 1 m pod ziemią. Jak mówi Salvatore Lorelli z DB InfraGO, problemem nie jest samo osiadanie, tylko to, że jeden odcinek osiada bardziej niż sąsiedni.</w:t>
-      </w:r>
-    </w:p>
-    <w:p>
-      <w:pPr>
-        <w:pStyle w:val="BodyText"/>
-      </w:pPr>
-      <w:r>
-        <w:rPr>
-          <w:bCs/>
-          <w:b/>
-        </w:rPr>
-        <w:t xml:space="preserve">Co zrobili (pilotaż na południe od Monachium):</w:t>
+        <w:t xml:space="preserve">Źródła danych</w:t>
       </w:r>
     </w:p>
     <w:p>
@@ -3306,195 +2718,7 @@
         </w:numPr>
         <w:pStyle w:val="Compact"/>
       </w:pPr>
-      <w:r>
-        <w:t xml:space="preserve">punkty EGMS w pasie 30 m wzdłuż toru (do ok. 1 km tam, gdzie jest zagrożenie naturalne) i ranking odcinków do utrzymania;</w:t>
-      </w:r>
-    </w:p>
-    <w:p>
-      <w:pPr>
-        <w:numPr>
-          <w:ilvl w:val="0"/>
-          <w:numId w:val="1006"/>
-        </w:numPr>
-        <w:pStyle w:val="Compact"/>
-      </w:pPr>
-      <w:r>
-        <w:t xml:space="preserve">połączenie z satelitarną wilgotnością gleby (GAF, 10–30 m, lata 2022–2023): warstwa 0–30 cm niewiele mówi, ale warstwa 60–100 cm wyraźnie wiąże się z ruchem terenu (np. rejon Garmisch–Murnau);</w:t>
-      </w:r>
-    </w:p>
-    <w:p>
-      <w:pPr>
-        <w:numPr>
-          <w:ilvl w:val="0"/>
-          <w:numId w:val="1006"/>
-        </w:numPr>
-        <w:pStyle w:val="Compact"/>
-      </w:pPr>
-      <w:r>
-        <w:t xml:space="preserve">EGMS pokazał też ruchy do 10 mm w ciągu dni–tygodni po silnych opadach;</w:t>
-      </w:r>
-    </w:p>
-    <w:p>
-      <w:pPr>
-        <w:numPr>
-          <w:ilvl w:val="0"/>
-          <w:numId w:val="1006"/>
-        </w:numPr>
-        <w:pStyle w:val="Compact"/>
-      </w:pPr>
-      <w:r>
-        <w:t xml:space="preserve">cel: profil ruchu wzdłuż całego toru zamiast rozproszonych punktów i krótszy czas od pomiaru do danych niż roczna aktualizacja EGMS.</w:t>
-      </w:r>
-    </w:p>
-    <w:p>
-      <w:pPr>
-        <w:pStyle w:val="FirstParagraph"/>
-      </w:pPr>
-      <w:r>
-        <w:t xml:space="preserve">Sami zastrzegają, że to dowód koncepcji: przed rutynowym użyciem potrzebna jest walidacja pomiarem naziemnym, a na zarośniętych odcinkach punktów EGMS jest mało albo nie ma ich wcale.</w:t>
-      </w:r>
-    </w:p>
-    <w:p>
-      <w:pPr>
-        <w:pStyle w:val="BodyText"/>
-      </w:pPr>
-      <w:r>
-        <w:rPr>
-          <w:bCs/>
-          <w:b/>
-        </w:rPr>
-        <w:t xml:space="preserve">Co to oznacza w świetle naszych wyników:</w:t>
-      </w:r>
-    </w:p>
-    <w:p>
-      <w:pPr>
-        <w:numPr>
-          <w:ilvl w:val="0"/>
-          <w:numId w:val="1007"/>
-        </w:numPr>
-        <w:pStyle w:val="Compact"/>
-      </w:pPr>
-      <w:r>
-        <w:rPr>
-          <w:bCs/>
-          <w:b/>
-        </w:rPr>
-        <w:t xml:space="preserve">Dokładnie to, co EGMS robi najlepiej.</w:t>
-      </w:r>
-      <w:r>
-        <w:t xml:space="preserve"> </w:t>
-      </w:r>
-      <w:r>
-        <w:t xml:space="preserve">DB interesuje różnica między sąsiednimi odcinkami, a ruch względny jest wiarygodny: w nieckach kierunek ruchu zgadzał się u nas na wszystkich reperach.</w:t>
-      </w:r>
-    </w:p>
-    <w:p>
-      <w:pPr>
-        <w:numPr>
-          <w:ilvl w:val="0"/>
-          <w:numId w:val="1007"/>
-        </w:numPr>
-        <w:pStyle w:val="Compact"/>
-      </w:pPr>
-      <w:r>
-        <w:rPr>
-          <w:bCs/>
-          <w:b/>
-        </w:rPr>
-        <w:t xml:space="preserve">Przesunięcie EGMS nie przeszkadza.</w:t>
-      </w:r>
-      <w:r>
-        <w:t xml:space="preserve"> </w:t>
-      </w:r>
-      <w:r>
-        <w:t xml:space="preserve">Wspólne „zero” znika, gdy porównuje się odcinki między sobą.</w:t>
-      </w:r>
-    </w:p>
-    <w:p>
-      <w:pPr>
-        <w:numPr>
-          <w:ilvl w:val="0"/>
-          <w:numId w:val="1007"/>
-        </w:numPr>
-        <w:pStyle w:val="Compact"/>
-      </w:pPr>
-      <w:r>
-        <w:rPr>
-          <w:bCs/>
-          <w:b/>
-        </w:rPr>
-        <w:t xml:space="preserve">Punkty, nie komórki.</w:t>
-      </w:r>
-      <w:r>
-        <w:t xml:space="preserve"> </w:t>
-      </w:r>
-      <w:r>
-        <w:t xml:space="preserve">DB bierze punkty w pasie 30 m, i słusznie: u nas komórka L3 100 m na brzegu niecki zaniżała ruch nawet o kilkanaście mm.</w:t>
-      </w:r>
-    </w:p>
-    <w:p>
-      <w:pPr>
-        <w:numPr>
-          <w:ilvl w:val="0"/>
-          <w:numId w:val="1007"/>
-        </w:numPr>
-        <w:pStyle w:val="Compact"/>
-      </w:pPr>
-      <w:r>
-        <w:rPr>
-          <w:bCs/>
-          <w:b/>
-        </w:rPr>
-        <w:t xml:space="preserve">Brakująca walidacja to nasza mocna strona.</w:t>
-      </w:r>
-      <w:r>
-        <w:t xml:space="preserve"> </w:t>
-      </w:r>
-      <w:r>
-        <w:t xml:space="preserve">DB sam pisze, że potrzebuje porównania z pomiarem naziemnym. My właśnie to zrobiliśmy dla niwelacji: typowa różnica po odjęciu przesunięcia to 3,4 mm w 3 lata, ale szum deklarowany przez EGMS jest ok. 2 razy za mały. To ważne przy ustawianiu progów alarmu.</w:t>
-      </w:r>
-    </w:p>
-    <w:p>
-      <w:pPr>
-        <w:numPr>
-          <w:ilvl w:val="0"/>
-          <w:numId w:val="1007"/>
-        </w:numPr>
-        <w:pStyle w:val="Compact"/>
-      </w:pPr>
-      <w:r>
-        <w:rPr>
-          <w:bCs/>
-          <w:b/>
-        </w:rPr>
-        <w:t xml:space="preserve">Częstsze dane.</w:t>
-      </w:r>
-      <w:r>
-        <w:t xml:space="preserve"> </w:t>
-      </w:r>
-      <w:r>
-        <w:t xml:space="preserve">DB chce skrócić czas między pomiarem a danymi. To ten sam kierunek co nasz plan własnego przetwarzania Sentinel-1 co 12 dni.</w:t>
-      </w:r>
-    </w:p>
-    <w:bookmarkEnd w:id="51"/>
-    <w:bookmarkStart w:id="56" w:name="źródła-danych"/>
-    <w:p>
-      <w:pPr>
-        <w:pStyle w:val="Heading1"/>
-      </w:pPr>
-      <w:r>
-        <w:t xml:space="preserve">Źródła danych</w:t>
-      </w:r>
-    </w:p>
-    <w:p>
-      <w:pPr>
-        <w:numPr>
-          <w:ilvl w:val="0"/>
-          <w:numId w:val="1008"/>
-        </w:numPr>
-        <w:pStyle w:val="Compact"/>
-      </w:pPr>
-      <w:hyperlink r:id="rId52">
+      <w:hyperlink r:id="rId51">
         <w:r>
           <w:rPr>
             <w:rStyle w:val="Hyperlink"/>
@@ -3506,18 +2730,18 @@
         <w:t xml:space="preserve"> </w:t>
       </w:r>
       <w:r>
-        <w:t xml:space="preserve">— EGMS L2b Calibrated 2020–2024 i L3 Ortho 2019–2023</w:t>
+        <w:t xml:space="preserve">— EGMS L2b Calibrated 2020–2024, L3 Ortho 2019–2023</w:t>
       </w:r>
     </w:p>
     <w:p>
       <w:pPr>
         <w:numPr>
           <w:ilvl w:val="0"/>
-          <w:numId w:val="1008"/>
+          <w:numId w:val="1006"/>
         </w:numPr>
         <w:pStyle w:val="Compact"/>
       </w:pPr>
-      <w:hyperlink r:id="rId53">
+      <w:hyperlink r:id="rId52">
         <w:r>
           <w:rPr>
             <w:rStyle w:val="Hyperlink"/>
@@ -3529,14 +2753,14 @@
         <w:t xml:space="preserve"> </w:t>
       </w:r>
       <w:r>
-        <w:t xml:space="preserve">— dobowe szeregi GNSS i prędkości MIDAS</w:t>
+        <w:t xml:space="preserve">— dobowe szeregi GNSS</w:t>
       </w:r>
     </w:p>
     <w:p>
       <w:pPr>
         <w:numPr>
           <w:ilvl w:val="0"/>
-          <w:numId w:val="1008"/>
+          <w:numId w:val="1006"/>
         </w:numPr>
         <w:pStyle w:val="Compact"/>
       </w:pPr>
@@ -3546,7 +2770,7 @@
       <w:r>
         <w:t xml:space="preserve"> </w:t>
       </w:r>
-      <w:hyperlink r:id="rId54">
+      <w:hyperlink r:id="rId53">
         <w:r>
           <w:rPr>
             <w:rStyle w:val="Hyperlink"/>
@@ -3555,15 +2779,12 @@
         </w:r>
       </w:hyperlink>
       <w:r>
+        <w:t xml:space="preserve">,</w:t>
+      </w:r>
+      <w:r>
         <w:t xml:space="preserve"> </w:t>
       </w:r>
-      <w:r>
-        <w:t xml:space="preserve">i</w:t>
-      </w:r>
-      <w:r>
-        <w:t xml:space="preserve"> </w:t>
-      </w:r>
-      <w:hyperlink r:id="rId55">
+      <w:hyperlink r:id="rId54">
         <w:r>
           <w:rPr>
             <w:rStyle w:val="Hyperlink"/>
@@ -3578,80 +2799,21 @@
         <w:t xml:space="preserve">— niwelacja</w:t>
       </w:r>
     </w:p>
+    <w:bookmarkEnd w:id="55"/>
+    <w:bookmarkStart w:id="60" w:name="literatura"/>
+    <w:p>
+      <w:pPr>
+        <w:pStyle w:val="Heading1"/>
+      </w:pPr>
+      <w:r>
+        <w:t xml:space="preserve">Literatura</w:t>
+      </w:r>
+    </w:p>
     <w:p>
       <w:pPr>
         <w:numPr>
           <w:ilvl w:val="0"/>
-          <w:numId w:val="1008"/>
-        </w:numPr>
-        <w:pStyle w:val="Compact"/>
-      </w:pPr>
-      <w:hyperlink r:id="rId50">
-        <w:r>
-          <w:rPr>
-            <w:rStyle w:val="Hyperlink"/>
-          </w:rPr>
-          <w:t xml:space="preserve">Copernicus Land Monitoring Service: Exploring an early warning layer for Europe’s largest rail network</w:t>
-        </w:r>
-      </w:hyperlink>
-      <w:r>
-        <w:t xml:space="preserve"> </w:t>
-      </w:r>
-      <w:r>
-        <w:t xml:space="preserve">— przypadek Deutsche Bahn</w:t>
-      </w:r>
-    </w:p>
-    <w:bookmarkEnd w:id="56"/>
-    <w:bookmarkStart w:id="62" w:name="literatura"/>
-    <w:p>
-      <w:pPr>
-        <w:pStyle w:val="Heading1"/>
-      </w:pPr>
-      <w:r>
-        <w:t xml:space="preserve">Literatura</w:t>
-      </w:r>
-    </w:p>
-    <w:p>
-      <w:pPr>
-        <w:numPr>
-          <w:ilvl w:val="0"/>
-          <w:numId w:val="1009"/>
-        </w:numPr>
-        <w:pStyle w:val="Compact"/>
-      </w:pPr>
-      <w:r>
-        <w:t xml:space="preserve">Blewitt G., Hammond W. C., Kreemer C. (2018). Harnessing the GPS data explosion for interdisciplinary science.</w:t>
-      </w:r>
-      <w:r>
-        <w:t xml:space="preserve"> </w:t>
-      </w:r>
-      <w:r>
-        <w:rPr>
-          <w:iCs/>
-          <w:i/>
-        </w:rPr>
-        <w:t xml:space="preserve">Eos</w:t>
-      </w:r>
-      <w:r>
-        <w:t xml:space="preserve">, 99.</w:t>
-      </w:r>
-      <w:r>
-        <w:t xml:space="preserve"> </w:t>
-      </w:r>
-      <w:hyperlink r:id="rId57">
-        <w:r>
-          <w:rPr>
-            <w:rStyle w:val="Hyperlink"/>
-          </w:rPr>
-          <w:t xml:space="preserve">doi:10.1029/2018EO104623</w:t>
-        </w:r>
-      </w:hyperlink>
-    </w:p>
-    <w:p>
-      <w:pPr>
-        <w:numPr>
-          <w:ilvl w:val="0"/>
-          <w:numId w:val="1009"/>
+          <w:numId w:val="1007"/>
         </w:numPr>
         <w:pStyle w:val="Compact"/>
       </w:pPr>
@@ -3674,7 +2836,7 @@
       <w:r>
         <w:t xml:space="preserve"> </w:t>
       </w:r>
-      <w:hyperlink r:id="rId58">
+      <w:hyperlink r:id="rId56">
         <w:r>
           <w:rPr>
             <w:rStyle w:val="Hyperlink"/>
@@ -3687,7 +2849,7 @@
       <w:pPr>
         <w:numPr>
           <w:ilvl w:val="0"/>
-          <w:numId w:val="1009"/>
+          <w:numId w:val="1007"/>
         </w:numPr>
         <w:pStyle w:val="Compact"/>
       </w:pPr>
@@ -3712,7 +2874,7 @@
       <w:pPr>
         <w:numPr>
           <w:ilvl w:val="0"/>
-          <w:numId w:val="1009"/>
+          <w:numId w:val="1007"/>
         </w:numPr>
         <w:pStyle w:val="Compact"/>
       </w:pPr>
@@ -3735,7 +2897,7 @@
       <w:r>
         <w:t xml:space="preserve"> </w:t>
       </w:r>
-      <w:hyperlink r:id="rId59">
+      <w:hyperlink r:id="rId57">
         <w:r>
           <w:rPr>
             <w:rStyle w:val="Hyperlink"/>
@@ -3748,7 +2910,7 @@
       <w:pPr>
         <w:numPr>
           <w:ilvl w:val="0"/>
-          <w:numId w:val="1009"/>
+          <w:numId w:val="1007"/>
         </w:numPr>
         <w:pStyle w:val="Compact"/>
       </w:pPr>
@@ -3771,7 +2933,7 @@
       <w:r>
         <w:t xml:space="preserve"> </w:t>
       </w:r>
-      <w:hyperlink r:id="rId60">
+      <w:hyperlink r:id="rId58">
         <w:r>
           <w:rPr>
             <w:rStyle w:val="Hyperlink"/>
@@ -3784,7 +2946,7 @@
       <w:pPr>
         <w:numPr>
           <w:ilvl w:val="0"/>
-          <w:numId w:val="1009"/>
+          <w:numId w:val="1007"/>
         </w:numPr>
         <w:pStyle w:val="Compact"/>
       </w:pPr>
@@ -3810,7 +2972,7 @@
       <w:r>
         <w:t xml:space="preserve"> </w:t>
       </w:r>
-      <w:hyperlink r:id="rId61">
+      <w:hyperlink r:id="rId59">
         <w:r>
           <w:rPr>
             <w:rStyle w:val="Hyperlink"/>
@@ -3819,7 +2981,7 @@
         </w:r>
       </w:hyperlink>
     </w:p>
-    <w:bookmarkEnd w:id="62"/>
+    <w:bookmarkEnd w:id="60"/>
     <w:sectPr/>
   </w:body>
 </w:document>
@@ -3926,6 +3088,82 @@
       </w:pPr>
     </w:lvl>
   </w:abstractNum>
+  <w:abstractNum w:abstractNumId="991">
+    <w:nsid w:val="A991"/>
+    <w:multiLevelType w:val="multilevel"/>
+    <w:lvl w:ilvl="0">
+      <w:numFmt w:val="bullet"/>
+      <w:lvlText w:val="•"/>
+      <w:lvlJc w:val="left"/>
+      <w:pPr>
+        <w:ind w:left="720" w:hanging="480"/>
+      </w:pPr>
+    </w:lvl>
+    <w:lvl w:ilvl="1">
+      <w:numFmt w:val="bullet"/>
+      <w:lvlText w:val="–"/>
+      <w:lvlJc w:val="left"/>
+      <w:pPr>
+        <w:ind w:left="1440" w:hanging="480"/>
+      </w:pPr>
+    </w:lvl>
+    <w:lvl w:ilvl="2">
+      <w:numFmt w:val="bullet"/>
+      <w:lvlText w:val="•"/>
+      <w:lvlJc w:val="left"/>
+      <w:pPr>
+        <w:ind w:left="2160" w:hanging="480"/>
+      </w:pPr>
+    </w:lvl>
+    <w:lvl w:ilvl="3">
+      <w:numFmt w:val="bullet"/>
+      <w:lvlText w:val="–"/>
+      <w:lvlJc w:val="left"/>
+      <w:pPr>
+        <w:ind w:left="2880" w:hanging="480"/>
+      </w:pPr>
+    </w:lvl>
+    <w:lvl w:ilvl="4">
+      <w:numFmt w:val="bullet"/>
+      <w:lvlText w:val="•"/>
+      <w:lvlJc w:val="left"/>
+      <w:pPr>
+        <w:ind w:left="3600" w:hanging="480"/>
+      </w:pPr>
+    </w:lvl>
+    <w:lvl w:ilvl="5">
+      <w:numFmt w:val="bullet"/>
+      <w:lvlText w:val="–"/>
+      <w:lvlJc w:val="left"/>
+      <w:pPr>
+        <w:ind w:left="4320" w:hanging="480"/>
+      </w:pPr>
+    </w:lvl>
+    <w:lvl w:ilvl="6">
+      <w:numFmt w:val="bullet"/>
+      <w:lvlText w:val="•"/>
+      <w:lvlJc w:val="left"/>
+      <w:pPr>
+        <w:ind w:left="5040" w:hanging="480"/>
+      </w:pPr>
+    </w:lvl>
+    <w:lvl w:ilvl="7">
+      <w:numFmt w:val="bullet"/>
+      <w:lvlText w:val="–"/>
+      <w:lvlJc w:val="left"/>
+      <w:pPr>
+        <w:ind w:left="5760" w:hanging="480"/>
+      </w:pPr>
+    </w:lvl>
+    <w:lvl w:ilvl="8">
+      <w:numFmt w:val="bullet"/>
+      <w:lvlText w:val="•"/>
+      <w:lvlJc w:val="left"/>
+      <w:pPr>
+        <w:ind w:left="6480" w:hanging="480"/>
+      </w:pPr>
+    </w:lvl>
+  </w:abstractNum>
   <w:abstractNum w:abstractNumId="99411">
     <w:nsid w:val="A99411"/>
     <w:multiLevelType w:val="multilevel"/>
@@ -4011,86 +3249,13 @@
       </w:pPr>
     </w:lvl>
   </w:abstractNum>
-  <w:abstractNum w:abstractNumId="991">
-    <w:nsid w:val="A991"/>
-    <w:multiLevelType w:val="multilevel"/>
-    <w:lvl w:ilvl="0">
-      <w:numFmt w:val="bullet"/>
-      <w:lvlText w:val="•"/>
-      <w:lvlJc w:val="left"/>
-      <w:pPr>
-        <w:ind w:left="720" w:hanging="480"/>
-      </w:pPr>
-    </w:lvl>
-    <w:lvl w:ilvl="1">
-      <w:numFmt w:val="bullet"/>
-      <w:lvlText w:val="–"/>
-      <w:lvlJc w:val="left"/>
-      <w:pPr>
-        <w:ind w:left="1440" w:hanging="480"/>
-      </w:pPr>
-    </w:lvl>
-    <w:lvl w:ilvl="2">
-      <w:numFmt w:val="bullet"/>
-      <w:lvlText w:val="•"/>
-      <w:lvlJc w:val="left"/>
-      <w:pPr>
-        <w:ind w:left="2160" w:hanging="480"/>
-      </w:pPr>
-    </w:lvl>
-    <w:lvl w:ilvl="3">
-      <w:numFmt w:val="bullet"/>
-      <w:lvlText w:val="–"/>
-      <w:lvlJc w:val="left"/>
-      <w:pPr>
-        <w:ind w:left="2880" w:hanging="480"/>
-      </w:pPr>
-    </w:lvl>
-    <w:lvl w:ilvl="4">
-      <w:numFmt w:val="bullet"/>
-      <w:lvlText w:val="•"/>
-      <w:lvlJc w:val="left"/>
-      <w:pPr>
-        <w:ind w:left="3600" w:hanging="480"/>
-      </w:pPr>
-    </w:lvl>
-    <w:lvl w:ilvl="5">
-      <w:numFmt w:val="bullet"/>
-      <w:lvlText w:val="–"/>
-      <w:lvlJc w:val="left"/>
-      <w:pPr>
-        <w:ind w:left="4320" w:hanging="480"/>
-      </w:pPr>
-    </w:lvl>
-    <w:lvl w:ilvl="6">
-      <w:numFmt w:val="bullet"/>
-      <w:lvlText w:val="•"/>
-      <w:lvlJc w:val="left"/>
-      <w:pPr>
-        <w:ind w:left="5040" w:hanging="480"/>
-      </w:pPr>
-    </w:lvl>
-    <w:lvl w:ilvl="7">
-      <w:numFmt w:val="bullet"/>
-      <w:lvlText w:val="–"/>
-      <w:lvlJc w:val="left"/>
-      <w:pPr>
-        <w:ind w:left="5760" w:hanging="480"/>
-      </w:pPr>
-    </w:lvl>
-    <w:lvl w:ilvl="8">
-      <w:numFmt w:val="bullet"/>
-      <w:lvlText w:val="•"/>
-      <w:lvlJc w:val="left"/>
-      <w:pPr>
-        <w:ind w:left="6480" w:hanging="480"/>
-      </w:pPr>
-    </w:lvl>
-  </w:abstractNum>
   <w:num w:numId="1000">
     <w:abstractNumId w:val="990"/>
   </w:num>
   <w:num w:numId="1001">
+    <w:abstractNumId w:val="991"/>
+  </w:num>
+  <w:num w:numId="1002">
     <w:abstractNumId w:val="99411"/>
     <w:lvlOverride w:ilvl="0">
       <w:startOverride w:val="1"/>
@@ -4120,10 +3285,10 @@
       <w:startOverride w:val="1"/>
     </w:lvlOverride>
   </w:num>
-  <w:num w:numId="1002">
+  <w:num w:numId="1003">
     <w:abstractNumId w:val="991"/>
   </w:num>
-  <w:num w:numId="1003">
+  <w:num w:numId="1004">
     <w:abstractNumId w:val="99411"/>
     <w:lvlOverride w:ilvl="0">
       <w:startOverride w:val="1"/>
@@ -4153,49 +3318,13 @@
       <w:startOverride w:val="1"/>
     </w:lvlOverride>
   </w:num>
-  <w:num w:numId="1004">
+  <w:num w:numId="1005">
     <w:abstractNumId w:val="991"/>
-  </w:num>
-  <w:num w:numId="1005">
-    <w:abstractNumId w:val="99411"/>
-    <w:lvlOverride w:ilvl="0">
-      <w:startOverride w:val="1"/>
-    </w:lvlOverride>
-    <w:lvlOverride w:ilvl="1">
-      <w:startOverride w:val="1"/>
-    </w:lvlOverride>
-    <w:lvlOverride w:ilvl="2">
-      <w:startOverride w:val="1"/>
-    </w:lvlOverride>
-    <w:lvlOverride w:ilvl="3">
-      <w:startOverride w:val="1"/>
-    </w:lvlOverride>
-    <w:lvlOverride w:ilvl="4">
-      <w:startOverride w:val="1"/>
-    </w:lvlOverride>
-    <w:lvlOverride w:ilvl="5">
-      <w:startOverride w:val="1"/>
-    </w:lvlOverride>
-    <w:lvlOverride w:ilvl="6">
-      <w:startOverride w:val="1"/>
-    </w:lvlOverride>
-    <w:lvlOverride w:ilvl="7">
-      <w:startOverride w:val="1"/>
-    </w:lvlOverride>
-    <w:lvlOverride w:ilvl="8">
-      <w:startOverride w:val="1"/>
-    </w:lvlOverride>
   </w:num>
   <w:num w:numId="1006">
     <w:abstractNumId w:val="991"/>
   </w:num>
   <w:num w:numId="1007">
-    <w:abstractNumId w:val="991"/>
-  </w:num>
-  <w:num w:numId="1008">
-    <w:abstractNumId w:val="991"/>
-  </w:num>
-  <w:num w:numId="1009">
     <w:abstractNumId w:val="991"/>
   </w:num>
 </w:numbering>

</xml_diff>